<commit_message>
Deepen Ganei Aviv interviews: Arab pupils in the classes, mixed neighborhood and community center
Co-Authored-By: Claude Fable 5.1 <noreply@anthropic.com>
Claude-Session: https://claude.ai/code/session_011Z9C2ptByc9jQga6MDruQz
</commit_message>
<xml_diff>
--- a/deliverables/ראיונות_9_מורות_קהילה_לוד.docx
+++ b/deliverables/ראיונות_9_מורות_קהילה_לוד.docx
@@ -93,7 +93,7 @@
           <w:szCs w:val="24"/>
           <w:rtl/>
         </w:rPr>
-        <w:t xml:space="preserve">הריאיון נערך בחדר המורים אחרי שעות הלימודים, משך ההקלטה 52 דקות.</w:t>
+        <w:t xml:space="preserve">הריאיון נערך בחדר המורים אחרי שעות הלימודים, משך ההקלטה 58 דקות.</w:t>
       </w:r>
     </w:p>
     <w:p>
@@ -129,7 +129,7 @@
           <w:szCs w:val="24"/>
           <w:rtl/>
         </w:rPr>
-        <w:t xml:space="preserve">הגעתי להוראה די במקרה. למדתי תואר ראשון בפסיכולוגיה, רציתי להמשיך לקליני, ובינתיים התחלתי לעבוד כסייעת בגן כדי להתפרנס. שם גיליתי שאני אוהבת את הכיתה יותר מאשר את הקליניקה. עשיתי הסבה להוראה, התחלתי בבית ספר קטן במושב ליד רמלה, ואחרי חמש שנים חיפשתי מקום גדול יותר, עם יותר אתגר. חברה שעבדה בזבולון אמרה לי שמחפשים מחנכת, באתי לראיון, ונשארתי תשע שנים. יום רגיל אצלי מתחיל בשבע וחצי בשער, כי אני אוהבת לראות את הילדים נכנסים ולדעת מי הגיע עם פרצוף כזה ומי עם פרצוף אחר. אחר כך שיעורים עד אחת, רוב היום בכיתה שלי, ובין לבין שיחות במסדרון עם הורים, עם היועצת, עם מי שצריך. אחרי הצהריים יש ישיבות, ובערב, בבית, יש הודעות מהורים בוואטסאפ, שאני משתדלת לא לענות עליהן אחרי שמונה, ולא תמיד מצליחה. זה לא יום שקט אף פעם, אבל אני לא יודעת לעבוד אחרת.</w:t>
+        <w:t xml:space="preserve">הגעתי להוראה די במקרה. למדתי תואר ראשון בפסיכולוגיה, רציתי להמשיך לקליני, ובינתיים התחלתי לעבוד כסייעת בגן כדי להתפרנס. שם גיליתי שאני אוהבת את הכיתה יותר מאשר את הקליניקה. עשיתי הסבה להוראה, התחלתי בבית ספר קטן במושב ליד רמלה, ואחרי חמש שנים חיפשתי מקום גדול יותר, עם יותר אתגר. חברה שעבדה בזבולון אמרה לי שמחפשים מחנכת, באתי לראיון, ונשארתי תשע שנים. יום רגיל אצלי מתחיל בשבע וחצי בשער, כי אני אוהבת לראות את הילדים נכנסים ולדעת מי הגיע עם פרצוף כזה ומי עם פרצוף אחר. בכיתה שלי עשרים ותשעה ילדים, ובהם שישה ילדים ערבים ממשפחות שגרות בשכונה, ושמונה ילדים ממשפחות דוברות רוסית, אז כבר בשער אני שומעת שלוש שפות. אחר כך שיעורים עד אחת, רוב היום בכיתה שלי, ובין לבין שיחות במסדרון עם הורים, עם היועצת, עם מי שצריך. אחרי הצהריים יש ישיבות, ובערב, בבית, יש הודעות מהורים בוואטסאפ, שאני משתדלת לא לענות עליהן אחרי שמונה, ולא תמיד מצליחה. זה לא יום שקט אף פעם, אבל אני לא יודעת לעבוד אחרת.</w:t>
       </w:r>
     </w:p>
     <w:p>
@@ -165,7 +165,7 @@
           <w:szCs w:val="24"/>
           <w:rtl/>
         </w:rPr>
-        <w:t xml:space="preserve">קהילה, בשבילי, זה קודם כול הילדים והמשפחות שלהם, ואז הצוות, ואז השכונה. אבל אני מודה שבגני אביב המילה הזאת מסובכת. זו שכונה שאנשים הגיעו אליה מכל מקום, מאוקראינה, מרוסיה, מאתיופיה, מהמרכז, מדרום העיר, ובשנים האחרונות גם משפחות של הגרעין התורני. אז מי שייך לקהילה? מבחינתי, כל מי שהילד שלו בכיתה שלי. אבל ההורים עצמם לא תמיד מרגישים שהם שייכים לאותה קהילה, ולפעמים בית הספר הוא המקום היחיד שבו הם נפגשים. אני חושבת שהקהילה של בית הספר היא משהו שאנחנו בונים, לא משהו שקיים לפני שהגענו. יש שכונות שבהן בית הספר נכנס לתוך קהילה קיימת, ואצלנו זה הפוך: בית הספר הוא זה שמייצר אותה, בערבי הורים, בשבת הכיתתית, בוואטסאפ הכיתתי. וגם המורות הן חלק, גם אם רובנו לא גרות בשכונה.</w:t>
+        <w:t xml:space="preserve">קהילה, בשבילי, זה קודם כול הילדים והמשפחות שלהם, ואז הצוות, ואז השכונה. אבל בגני אביב המילה הזאת מסובכת, כי זו שכונה שאנשים הגיעו אליה מכל מקום: מאוקראינה, מרוסיה, מאתיופיה, מהמרכז, מהשכונות הערביות הוותיקות של לוד, ובשנים האחרונות גם משפחות של הגרעין התורני. אז מי שייך? מבחינתי, כל מי שהילד שלו בכיתה שלי: גם האמא מרמת אשכול שעברה לגני אביב כדי שהילדים ילמדו בבית ספר עם מעבדה, גם הסבתא מאודסה, גם האבא מהגרעין. ההורים עצמם לא תמיד מרגישים שהם שייכים לאותה קהילה, ולפעמים בית הספר הוא המקום היחיד שבו הם נפגשים בכלל. אני חושבת שהקהילה של בית הספר היא משהו שאנחנו בונים, לא משהו שקיים לפני שהגענו. בשכונות אחרות בלוד, גם ערביות וגם יהודיות, בית הספר נכנס לתוך קהילה קיימת. אצלנו זה הפוך: אין קהילה אחת של גני אביב, יש כמה קהילות שגרות באותם בניינים, ובית הספר הוא זה שמייצר ביניהן משהו משותף, בערבי הורים, בשבת הכיתתית, בוואטסאפ הכיתתי. וגם המורות הן חלק, גם אם רובנו לא גרות בשכונה. אם הייתי צריכה להגדיר במשפט: הקהילה של בית הספר שלי היא כל מי שמוכן לשבת ליד מישהו שלא דומה לו בגלל שהילדים שלהם באותה כיתה.</w:t>
       </w:r>
     </w:p>
     <w:p>
@@ -201,7 +201,7 @@
           <w:szCs w:val="24"/>
           <w:rtl/>
         </w:rPr>
-        <w:t xml:space="preserve">גני אביב היא שכונה גדולה, אולי הגדולה בלוד, שנבנתה בשנות התשעים בשביל העלייה מברית המועצות לשעבר. עד היום רוב המשפחות אצלנו הן דוברות רוסית, הורים או סבים, וזה קובע הרבה: הערכה גבוהה ללימודים, דרישה למשמעת, ולפעמים חוסר אמון במערכת שמרגישה להם רכה מדי. יש גם משפחות יוצאות אתיופיה, בעיקר בבניינים הישנים, ובשנים האחרונות משפחות צעירות דתיות שהגיעו עם הגרעין. ואז יש את מי שהגיע כי הדירות זולות: משפחות ממרכז הארץ שלא יכלו לקנות שם. אז בכיתה של עשרים ותשעה ילדים יש לי כמעט את כל ישראל. רוב ההורים עובדים קשה, הרבה בעבודות משמרות, בנתב"ג, בלוגיסטיקה, ובלא מעט בתים הסבתא היא זו שמגדלת. השכונה עצמה השתנתה הרבה מאז שהגעתי: יותר גינות, יותר מרכזים מסחריים, אבל גם יותר פערים. יש בניינים משופצים ליד בניינים שנראים כמו לפני שלושים שנה, ואני רואה את זה על הילדים.</w:t>
+        <w:t xml:space="preserve">גני אביב היא שכונה גדולה, אולי הגדולה בלוד, שנבנתה בשנות התשעים בשביל העלייה מברית המועצות לשעבר. עד היום הרבה מהמשפחות אצלנו הן דוברות רוסית, הורים או סבים, וזה קובע הרבה: הערכה גבוהה ללימודים, דרישה למשמעת, ולפעמים חוסר אמון במערכת שמרגישה להם רכה מדי. יש משפחות יוצאות אתיופיה, בעיקר בבניינים הישנים, ובשנים האחרונות משפחות צעירות דתיות שהגיעו עם הגרעין. ויש, וזה משהו שאנשים מחוץ ללוד לא יודעים, הרבה משפחות ערביות: משפחות מהשכונות הוותיקות של העיר שקנו או שכרו דירות בגני אביב, בדרך כלל זוגות צעירים עם השכלה, אחיות, מורים, עובדי נתב"ג, שרצו לצאת מהצפיפות ומהאלימות ולתת לילדים בית ספר אחר. בכל כיתה אצלנו יש היום חמישה או שישה ילדים ערבים, ובכיתות א' לפעמים יותר. אז בכיתה של עשרים ותשעה ילדים יש לי כמעט את כל ישראל, בלי הגזמה. רוב ההורים עובדים קשה, הרבה בעבודות משמרות, ובלא מעט בתים הסבתא היא זו שמגדלת. השכונה עצמה השתנתה הרבה מאז שהגעתי: יותר גינות, יותר מרכזים מסחריים, מתנ"ס שעובד, אבל גם יותר פערים. יש בניינים משופצים ליד בניינים שנראים כמו לפני שלושים שנה, ואני רואה את זה על הילדים. ומה שמעניין הוא שהמשפחות הערביות שמגיעות הן בדרך כלל המשפחות החזקות של השכונות שלהן, ובשכונה שלנו הן דווקא בין הבתים היציבים.</w:t>
       </w:r>
     </w:p>
     <w:p>
@@ -237,7 +237,7 @@
           <w:szCs w:val="24"/>
           <w:rtl/>
         </w:rPr>
-        <w:t xml:space="preserve">הקשר עם ההורים הוא רוב העבודה שלי כמחנכת, יותר מהלימודים עצמם. ביום יום זה וואטסאפ: הודעות על שיעורי בית, על טיולים, על ילד שלא הרגיש טוב. יש לי כלל שכל הורה מקבל ממני לפחות הודעה אישית אחת בחודש, משהו טוב על הילד, כדי שהשיחה הראשונה לא תהיה על בעיה. הקשר מתהדק כשיש משבר: ילד שעובר משהו בבית, אירוע בכיתה, ואז פתאום ההורים ואני צוות. והוא מתרופף כשההורה מרגיש שאני שופטת אותו. עם ההורים דוברי הרוסית למדתי שהמפתח הוא כבוד ודיוק: לא להתקשר בלי סיבה, לא לדבר בכלליות, להגיד בדיוק מה קרה ומה אני מציעה. עם משפחות אחרות זה הפוך, הן רוצות שאשאל מה שלומן לפני שאני עוברת לעניין. הדבר הכי קשה הוא הורים שלא עונים. לא כי לא אכפת להם, אלא כי הם במשמרת, או כי העברית שלהם לא מספיקה, או כי הם מתביישים. את אלה אני מחפשת בשער בבוקר.</w:t>
+        <w:t xml:space="preserve">הקשר עם ההורים הוא רוב העבודה שלי כמחנכת, יותר מהלימודים עצמם. ביום יום זה וואטסאפ: הודעות על שיעורי בית, על טיולים, על ילד שלא הרגיש טוב. יש לי כלל שכל הורה מקבל ממני לפחות הודעה אישית אחת בחודש, משהו טוב על הילד, כדי שהשיחה הראשונה לא תהיה על בעיה. הקשר מתהדק כשיש משבר: ילד שעובר משהו בבית, אירוע בכיתה, ואז פתאום ההורים ואני צוות. והוא מתרופף כשההורה מרגיש שאני שופטת אותו. עם ההורים דוברי הרוסית למדתי שהמפתח הוא כבוד ודיוק: לא להתקשר בלי סיבה, להגיד בדיוק מה קרה ומה אני מציעה. עם ההורים הערבים למדתי משהו אחר: הקשר הראשון חייב להיות אישי, פנים אל פנים, לא בהודעה. בשנה הראשונה שלי בכיתה עם ילדים ערבים שלחתי הודעות כמו לכולם, ואף אחד מהם לא ענה, וחשבתי שלא אכפת להם. ואז אמא אחת, אחות בבית חולים, באה לשער ואמרה לי: "אנחנו לא יודעים אם את רוצה אותנו פה". מאז אני מזמינה כל משפחה ערבית חדשה לשיחה אישית בשבוע הראשון, ואומרת בקול שהילד שלהם רצוי. אחרי זה הם ההורים הכי מעורבים שיש לי. והקשר הכי יפה שראיתי נוצר בין אימהות: אמא ערבייה ואמא דוברת רוסית שהילדים שלהן חברים מהמתנ"ס מנהלות היום יחד את ועד הכיתה, ומתרגמות אחת לשנייה את ההודעות שלי. הדבר הכי קשה הוא הורים שלא עונים בכלל, ואת אלה אני מחפשת בשער בבוקר.</w:t>
       </w:r>
     </w:p>
     <w:p>
@@ -273,7 +273,7 @@
           <w:szCs w:val="24"/>
           <w:rtl/>
         </w:rPr>
-        <w:t xml:space="preserve">השנה שעברה, אחרי תקופה קשה של טילים ושל הרבה ימים בבית, החלטנו לעשות "יום קהילה" בבית הספר, בשבת. כל כיתה הכינה דוכן על המדינה שממנה הגיעה משפחה אחת מהכיתה, עם אוכל, עם מוזיקה, עם סיפור של הסבתא. הסבתות הגיעו. זאת הייתה הפעם הראשונה שראיתי סבתא מאוקראינה וסבתא מאתיופיה יושבות באותו ספסל וטועמות אחת מהאוכל של השנייה. אבא אחד, נהג משאית שאף פעם לא הגיע לאסיפות, עמד שלוש שעות ליד דוכן הפלוב של הכיתה שלנו והסביר לכולם איך מכינים. הילדים ראו את ההורים שלהם ככאלה שיש להם משהו לתת, ולא רק ככאלה שמקבלים הודעות מהמורה. מה שנשאר מזה הוא קבוצת וואטסאפ של הורים שהתחילה לארגן דברים בעצמה: חלוקת מדים משומשים, הסעה משותפת לחוג. אני כבר לא מעורבת בזה, וזה בדיוק מה שרציתי. פעם אחת בשנה שבה הקהילה לא צריכה אותי כדי להתקיים.</w:t>
+        <w:t xml:space="preserve">השנה שעברה, אחרי תקופה קשה של טילים ושל הרבה ימים בבית, החלטנו לעשות "יום קהילה" בבית הספר, בשבת. כל כיתה הכינה דוכן על המקום שממנו הגיעה משפחה אחת מהכיתה, עם אוכל, עם מוזיקה, עם סיפור של הסבתא. בכיתה שלי היו ארבעה דוכנים: אוקראינה, אתיופיה, ירושלים, ולוד הישנה, שאותו הכינה משפחה ערבית שהסבא שלה נולד בעיר העתיקה לפני ארבעים ושמונה. הסבתות הגיעו. ראיתי סבתא מאוקראינה וסבתא מלוד הישנה יושבות באותו ספסל וטועמות אחת מהאוכל של השנייה, בלי שפה משותפת, עם ידיים. אבא אחד, נהג משאית שאף פעם לא הגיע לאסיפות, עמד שלוש שעות ליד דוכן הפלוב והסביר לכולם איך מכינים, והסבא מלוד הישנה סיפר על השוק שהיה פעם איפה שהיום הקניון, ולילדים היהודים לא היה מושג שהיה שם שוק. הילדים ראו את ההורים שלהם ככאלה שיש להם משהו לתת, ולא רק ככאלה שמקבלים הודעות מהמורה. מה שנשאר מזה הוא קבוצת וואטסאפ של הורים שהתחילה לארגן דברים בעצמה: חלוקת מדים משומשים, הסעה משותפת לחוג הכדורגל במתנ"ס, שבו משחקים הילדים היהודים והערבים של הכיתה ביחד. אני כבר לא מעורבת בזה, וזה בדיוק מה שרציתי. פעם אחת בשנה שבה הקהילה לא צריכה אותי כדי להתקיים.</w:t>
       </w:r>
     </w:p>
     <w:p>
@@ -309,7 +309,7 @@
           <w:szCs w:val="24"/>
           <w:rtl/>
         </w:rPr>
-        <w:t xml:space="preserve">כן, ואני זוכרת את זה טוב. לפני שלוש שנים הגיעו לכיתה שלי שלושה ילדים ממשפחות של הגרעין התורני, והיה מתח. חלק מההורים הוותיקים הרגישו שהגרעין "משתלט" על השכונה, ואמרו את זה בקבוצת הוואטסאפ, וחלק מהורי הגרעין הרגישו שלא רוצים אותם. אני עמדתי באמצע. מצד אחד, אלה ילדים בכיתה שלי. מצד שני, גם ההורים הוותיקים הם ההורים שלי. היה ערב הורים שבו הוויכוח על חלוקת התפקידים בוועד הכיתה הפך לוויכוח על מי השכונה הזאת. יצאתי משם בוכה, באוטו. מה שהשפיע עליי הוא שהבנתי שאני לא יכולה להיות "ניטרלית", כי הילדים שומעים הכול בבית. מה שעשיתי זה לעצור את השיח הזה בקבוצה, להוציא מהקבוצה כל מה שלא קשור לילדים, ולהקפיד שבכיתה עצמה כל ילד מוצג דרך מה שהוא יודע ולא מאיפה הוא. לקח שנה. היום הורים משני הצדדים מגיעים לאותה שבת כיתתית. אבל המתח לא נעלם, הוא רק לא נכנס לכיתה. אני רוצה להוסיף משהו שקשה לי להגיד: באותו ערב הורים הבנתי שגם לי יש צד, ושאני צריכה להיזהר ממנו. גדלתי בבית חילוני, ובפעם הראשונה ששמעתי על הגרעין גם אני חשבתי "מה הם רוצים פה". זה שאני המחנכת לא הופך אותי לנייטרלית, זה רק מחייב אותי להתנהג כאילו. ובשנה ההיא למדתי להפריד בין מה שאני חושבת על השכונה לבין מה שאני עושה בכיתה, וזה הדבר הכי קשה שלמדתי בארבע עשרה שנים. היום, כשהורה מהגרעין וכשהורה ותיק יושבים מולי, אני יודעת ששניהם בודקים אם אני "שלהם", ואני עונה לשניהם אותו דבר: אני של הילד.</w:t>
+        <w:t xml:space="preserve">כן, ואני זוכרת את זה טוב. במאי 2021, כשהיו המהומות בלוד, זה נכנס לי לכיתה בבת אחת. ביום הראשון אחרי הלילה הקשה הגיעו לכיתה עשרים ילדים, ואף אחד מששת הילדים הערבים לא הגיע. ההורים שלהם פחדו, וחלקם, כך נודע לי אחר כך, נסעו לכמה ימים לקרובי משפחה. והילדים שכן הגיעו דיברו, בכיתה ג', על "הערבים" במילים ששמעו בבית. ילד אחד שאל אם עומר, החבר שלו מהכדורגל, "גם איתם". לא ידעתי מה להגיד. יצאתי לשירותים ובכיתי. ואז חזרתי ועשיתי את הדבר היחיד שידעתי: ביקשתי מכל ילד לכתוב מכתב לילד מהכיתה שלא הגיע היום. הם כתבו. "עומר, אני שומר לך את המקום בכדורגל". "לין, איפה את, הסתיים הפרויקט בלעדייך". כשהילדים הערבים חזרו, אחרי שבוע, המכתבים חיכו להם על השולחנות. אמא של לין צילמה את המכתב ושלחה לי בלילה בלי מילים, רק לב. היה גם צד אחר: הורה יהודי התלונן שאני "עושה פוליטיקה", והורה ערבי אחד ביקש להעביר את הילד לבית ספר ערבי ובסוף נשאר. מה שהשפיע עליי הוא שהבנתי שאין לי אפשרות להיות "ניטרלית" בכיתה כזאת, כי הילדים חיים את העיר המעורבת בגוף שלהם, ושהתפקיד שלי הוא לא להסביר להם את העיר, אלא להחזיק את הכיתה כמקום שבו הם לא צריכים לבחור צד. המתח לא נעלם, הוא רק לא נכנס לכיתה.</w:t>
       </w:r>
     </w:p>
     <w:p>
@@ -345,7 +345,7 @@
           <w:szCs w:val="24"/>
           <w:rtl/>
         </w:rPr>
-        <w:t xml:space="preserve">בגני אביב, האמת, העירוב של לוד כמעט לא מורגש ביום יום. אין לנו תלמידים ערבים, והשכונה היא רחוקה מהשכונות הערביות. הילדים יודעים שיש ערבים בלוד בעיקר מהחדשות ומהעובדה שההורים אומרים להם לא להסתובב בשכונות מסוימות. זה בא לידי ביטוי בעיקר במה שלא קורה: אין מפגשים, אין פרויקטים משותפים, ואם אני מעלה את הנושא בחדר המורים יש שתיקה. אחרי האירועים במאי 2021 זה נהיה יותר קשה. ילדים הגיעו לכיתה עם פחד, היו הורים שביקשו שלא נדבר על זה בכלל, והיו כאלה שביקשו שנדבר רק על הצד שלהם. אני עשיתי שיעור על "מה זה שכן", בלי להזכיר אף אחד, ועדיין קיבלתי תלונה. בשנה שעברה היה ניסיון של העירייה לעשות פעילות משותפת של בתי ספר מהמגזרים, אבל מהצוות שלנו הגיעו שתי מורות בלבד, ואני לא הייתי אחת מהן, ואני לא גאה בזה. אם לשאול אם העיר המעורבת היא חלק מהקהילה של בית הספר, התשובה הכנה היא שלא, והייתי רוצה שזה יהיה אחרת.</w:t>
+        <w:t xml:space="preserve">בגני אביב העיר המעורבת היא לא רעיון, היא הרכב הכיתה. יש לי שישה ילדים ערבים מתוך עשרים ותשעה, ובכל כיתה בבית הספר זה דומה. הם גרים באותם בניינים כמו הילדים היהודים, הולכים לאותו מתנ"ס, לאותו חוג כדורגל, לאותה חנות. בכיתה ג' זה בא לידי ביטוי בעיקר בשפה: ילד ערבי שמגיע לכיתה א' לפעמים בלי עברית, ובסוף כיתה ב' הוא מדבר כמו כולם, כי הוא למד את השפה מהחברים בהפסקה ובמתנ"ס יותר מאשר ממני. ראיתי ילדים יהודים לומדים מילים בערבית מהחברים ומשתמשים בהן בגאווה. זה בא לידי ביטוי גם בחגים: אנחנו מציינים בכיתה את הרמדאן ואת עיד אל-פיטר, ואמא ערבייה באה לספר, ובחנוכה היא מגיעה עם הילד להדלקת נרות. ובא לידי ביטוי במתחים: במאי 2021, כמו שסיפרתי, ובתקופת המלחמה, כשילד יהודי שאבא שלו במילואים וילד ערבי שהמשפחה שלו בעזה יושבים באותה שורה. אני לא מדברת על זה בכיתה ג' במונחים פוליטיים, אבל אני גם לא מעמידה פנים שזה לא קיים. יש לנו שיעור קבוע של "מה קרה השבוע" שבו כל ילד יכול להגיד מה הוא מרגיש, ובשבועות קשים זה השיעור החשוב ביותר. מה שאין לנו הוא קשר עם בתי הספר הערביים בעיר, ובזה אני חושבת שאנחנו מפספסים: הילדים הערבים שלי יוצאים מהשכונה לבקר סבתא בשכונה הערבית, והילדים היהודים לא היו שם אף פעם. העיר המעורבת היא בכיתה, אבל היא עדיין לא בעיר.</w:t>
       </w:r>
     </w:p>
     <w:p>
@@ -381,7 +381,7 @@
           <w:szCs w:val="24"/>
           <w:rtl/>
         </w:rPr>
-        <w:t xml:space="preserve">אני חושבת שהתפקיד לא נגמר בשער, אבל צריך שיהיה לו גבול, אחרת אין מורה. אני יודעת את השמות של האחים הקטנים, אני יודעת מי ההורים גרושים ומי האבא עובד בלילה, ואני משתמשת בזה בכיתה. אם ילד מגיע בלי ארוחת בוקר שלושה ימים, אני לא מתקשרת לרווחה, אני מתקשרת לאמא ומבינה מה קרה. ובאירועים בשכונה אני מגיעה: לבר מצווה של תלמיד לשעבר, לשבעה כשצריך. אבל אני גרה ברמלה, ובכוונה. אני צריכה לצאת מהשכונה בסוף היום. יש מורות שגרות בגני אביב ופוגשות את ההורים בסופר, וזה טוב לקשר ורע לנפש. הקהילה כן מצפה ממני לדברים שלא כתובים: לעזור במילוי טופס לביטוח לאומי, לדבר עם אח גדול שמסתבך, להיות המבוגר שמבין עברית בבית שבו אף אחד לא קורא מכתבים רשמיים. אני עושה חלק מזה, ואני אומרת לא לחלק, ואני לא תמיד יודעת איפה הקו.</w:t>
+        <w:t xml:space="preserve">אני חושבת שהתפקיד לא נגמר בשער, אבל צריך שיהיה לו גבול, אחרת אין מורה. אני יודעת את השמות של האחים הקטנים, אני יודעת מי ההורים גרושים ומי האבא עובד בלילה, ואני משתמשת בזה בכיתה. אם ילד מגיע בלי ארוחת בוקר שלושה ימים, אני לא מתקשרת לרווחה, אני מתקשרת לאמא ומבינה מה קרה. ובאירועים בשכונה אני מגיעה: לבר מצווה של תלמיד לשעבר, לשבעה כשצריך, ובשנה שעברה גם לחגיגת עיד אצל משפחה מהכיתה, בפעם הראשונה בחיי, ולמדתי שם יותר על הילד מאשר בשנה של שיעורים. אבל אני גרה ברמלה, ובכוונה. אני צריכה לצאת מהשכונה בסוף היום. הקהילה כן מצפה ממני לדברים שלא כתובים: לעזור במילוי טופס לביטוח לאומי, לדבר עם אח גדול שמסתבך, להיות המבוגר שמבין עברית בבית שבו אף אחד לא קורא מכתבים רשמיים, וזה נכון גם לבית דובר רוסית וגם לבית דובר ערבית. ויש ציפייה חדשה, שהרגשתי בשנתיים האחרונות: שאהיה מי שמחזיקה את השלום בכיתה כשבעיר אין שלום. הורים ערבים אמרו לי שהם שולחים את הילד אליי כי "אצלך הוא בטוח", והורים יהודים אמרו משפט דומה. זו ציפייה שאני לא יודעת אם אני עומדת בה, אבל אני מבינה שהיא חלק מהתפקיד של מורה בעיר הזאת.</w:t>
       </w:r>
     </w:p>
     <w:p>
@@ -417,7 +417,7 @@
           <w:szCs w:val="24"/>
           <w:rtl/>
         </w:rPr>
-        <w:t xml:space="preserve">מה שנותן לי שייכות זה הצוות. אנחנו צוות של נשים שעובדות יחד הרבה שנים, שמכסות אחת על השנייה, שיודעות מתי מישהי צריכה לצאת מוקדם ולא שואלות למה. והילדים, כמובן: כשילד שלימדתי בכיתה ג' בא לבקר בכיתה ח' ואומר "את היית המורה שלי", אני שייכת. מה שגורם לי להרגיש זרה הוא דווקא השפה. בשבת הכיתתית, כשההורים מדברים ביניהם רוסית ואני לא מבינה, אני פתאום האורחת ולא המארחת. למדתי כמה מילים, אבל זה לא אותו דבר. וגם הגובה שלי בעיר: אני לא תושבת לוד, אני לא מצביעה כאן, ולפעמים בוויכוחים על השכונה הורים אומרים לי בעדינות "את לא גרה פה, את לא מבינה". הם צודקים ולא צודקים. אני לא גרה פה, אבל אני כאן יותר שעות ביום מאשר רובם.</w:t>
+        <w:t xml:space="preserve">מה שנותן לי שייכות זה הצוות. אנחנו צוות של נשים שעובדות יחד הרבה שנים, שמכסות אחת על השנייה, שיודעות מתי מישהי צריכה לצאת מוקדם ולא שואלות למה. והילדים, כמובן: כשילד שלימדתי בכיתה ג' בא לבקר בכיתה ח' ואומר "את היית המורה שלי", אני שייכת. מה שגורם לי להרגיש זרה הוא דווקא השפה, ובכיתה שלי זה כפול. בשבת הכיתתית ההורים מדברים ביניהם רוסית בפינה אחת וערבית בפינה אחרת, ואני, שמדברת רק עברית, פתאום האורחת ולא המארחת. למדתי כמה מילים בשתי השפות, והילדים מתקנים לי את ההגייה בערבית בצחוק, אבל זה לא אותו דבר. וגם המקום שלי בעיר: אני לא תושבת לוד, אני לא מצביעה כאן, ובוויכוחים על השכונה הורים אומרים לי בעדינות "את לא גרה פה, את לא מבינה". הם צודקים ולא צודקים. אני לא גרה פה, אבל אני כאן יותר שעות ביום מאשר רובם, ואני היחידה שרואה את הילד הערבי ואת הילד הרוסי ואת הילד מהגרעין יושבים יחד כל בוקר, וזה משהו שאף הורה בשכונה לא רואה.</w:t>
       </w:r>
     </w:p>
     <w:p>
@@ -453,7 +453,7 @@
           <w:szCs w:val="24"/>
           <w:rtl/>
         </w:rPr>
-        <w:t xml:space="preserve">הייתי רוצה שיהיה בבית הספר מקום פיזי להורים. חדר, או פינה, שבו הורה יכול לשבת, לשתות קפה, לפגוש הורה אחר, לחכות לילד בלי לעמוד בשער. היום ההורים נכנסים לבית הספר רק כשקוראים להם, וזה אומר שכל כניסה שלהם היא על בעיה. מקום כזה היה הופך את בית הספר מכתובת לבית, ובשכונה שבה אין כמעט מקומות מפגש אחרים, זה היה יכול להיות המקום שבו הקהילה, זאת שאמרתי שאנחנו בונים, מתחילה להתקיים גם בלעדינו. ולמה דווקא זה? כי כל השאר, הפעילויות, הימים המיוחדים, תלוי במורות, ובשנה שבה המורות עייפות זה לא קורה. חדר הוא חדר. הוא נשאר גם כשאני לא. ניסיתי להעלות את זה בהנהלה, ואמרו לי שאין מקום. יש מקום. אין מישהו שמחזיק את זה.</w:t>
+        <w:t xml:space="preserve">הייתי רוצה שיהיה בבית הספר מקום פיזי להורים. חדר, או פינה, שבו הורה יכול לשבת, לשתות קפה, לפגוש הורה אחר, לחכות לילד בלי לעמוד בשער. היום ההורים נכנסים לבית הספר רק כשקוראים להם, וזה אומר שכל כניסה שלהם היא על בעיה. מקום כזה היה הופך את בית הספר מכתובת לבית, ובשכונה שבה אין כמעט מקומות מפגש אחרים חוץ מהמתנ"ס, זה היה יכול להיות המקום שבו הקהילה, זאת שאמרתי שאנחנו בונים, מתחילה להתקיים גם בלעדינו. ואני חושבת על זה במיוחד בגלל ההורים הערבים והרוסים: שתי הקבוצות האלה לא נפגשות בשום מקום בשכונה, חוץ מאשר כשהילדים שלהן משחקים כדורגל, ואז ההורים עומדים בצד ולא מדברים. חדר בבית הספר, עם קפה, בלי סדר יום, היה המקום היחיד שבו הם היו יושבים באותו שולחן. ולמה דווקא זה? כי כל השאר, הפעילויות, הימים המיוחדים, תלוי במורות, ובשנה שבה המורות עייפות זה לא קורה. חדר הוא חדר. הוא נשאר גם כשאני לא. ניסיתי להעלות את זה בהנהלה, ואמרו לי שאין מקום. יש מקום. אין מישהו שמחזיק את זה.</w:t>
       </w:r>
     </w:p>
     <w:p>
@@ -489,7 +489,7 @@
           <w:szCs w:val="24"/>
           <w:rtl/>
         </w:rPr>
-        <w:t xml:space="preserve">כן, דבר אחד. כשמדברים על קהילה ובית ספר מדברים כאילו הקהילה היא משהו טוב שצריך רק לחבר אליו. בגני אביב הקהילה היא גם משהו שלפעמים צריך להגן על הילד ממנו: מהריב בין השכנים, מהשיח בקבוצות, מהסטיגמה של "ילד מהבניינים ההם". בית הספר הוא לפעמים המקום היחיד שבו ילד הוא רק ילד. אז אם המחקר שלך שואל איך לחבר את בית הספר לקהילה, הייתי שואלת גם מתי בית הספר צריך להיות קצת נפרד ממנה. ועוד משהו קטן: תשאלי את המורות מאיפה הן. כי מורה שגרה בשכונה ומורה שגרה בחוץ רואות את הקהילה אחרת לגמרי, ושתינו צודקות. ואולי עוד דבר אחרון: תשאלי מה קרה לקשר הזה במלחמה. אצלנו היו חודשים שבהם ההורים ואני דיברנו יותר מאי פעם, על פחד, על מילואים, על ילדים שלא ישנים, ובחודשים האלה הרגשתי בפעם הראשונה שאני לא רק המחנכת של הילדים אלא גם מישהי שההורים נשענים עליה. אני לא בטוחה שזה טוב, אבל זה שינה את מה שאני מבינה במילה קהילה.</w:t>
+        <w:t xml:space="preserve">כן, שני דברים. הראשון: כשמדברים על קהילה ובית ספר, מדברים כאילו הקהילה היא משהו טוב שצריך רק לחבר אליו. בגני אביב הקהילה היא גם משהו שלפעמים צריך להגן על הילד ממנו: מהריב בין השכנים, מהשיח בקבוצות, ממה שאומרים בבית על "הם". בית הספר הוא לפעמים המקום היחיד שבו ילד ערבי וילד יהודי הם רק ילדים. אז אם המחקר שואל איך לחבר את בית הספר לקהילה, הייתי שואלת גם מתי בית הספר צריך להיות קצת נפרד ממנה. השני, וזה חשוב לי שייכתב: אנשים מחוץ ללוד חושבים ש"בית ספר יהודי" בלוד הוא בית ספר של יהודים. בשכונה שלנו זה כבר לא נכון, ואני לא בטוחה שמשרד החינוך או העירייה יודעים מה לעשות עם זה. אין לי שעות ערבית, אין לי יועצת דוברת ערבית, אין לי חומרי לימוד שמתייחסים לזה שחמישית מהכיתה חוגגת חגים אחרים. אני בונה את זה לבד, כל שנה מחדש, עם האימהות. אם המחקר ישאל מה קורה כשהעיר המעורבת נכנסת לבית ספר שלא תוכנן לזה, הוא ישאל את השאלה הכי חשובה שיש לנו.</w:t>
       </w:r>
     </w:p>
     <w:p>
@@ -547,7 +547,7 @@
           <w:szCs w:val="24"/>
           <w:rtl/>
         </w:rPr>
-        <w:t xml:space="preserve">הריאיון נערך בביתה של המרואיינת, משך ההקלטה 58 דקות.</w:t>
+        <w:t xml:space="preserve">הריאיון נערך בביתה של המרואיינת, משך ההקלטה 61 דקות.</w:t>
       </w:r>
     </w:p>
     <w:p>
@@ -583,7 +583,7 @@
           <w:szCs w:val="24"/>
           <w:rtl/>
         </w:rPr>
-        <w:t xml:space="preserve">אני באתי להוראה מהמתמטיקה, לא מהחינוך. באוקראינה למדתי מתמטיקה, עליתי בגיל עשרים ושתיים, ובהתחלה עבדתי במפעל כי לא הייתה עברית. אחרי כמה שנים עשיתי הסבה להוראה במכללה, ולימדתי שנתיים ברמלה. לזבולון הגעתי לפני שבע עשרה שנים כי עברנו לגור בגני אביב, ורציתי ללמד במקום שאני גרה בו. היום אני לא בטוחה שזה היה רעיון טוב, אבל אני לא אעזוב. יום רגיל מתחיל בזה שאני הולכת ברגל לבית הספר ופוגשת בדרך חמישה הורים לפחות. בבית הספר אני מלמדת שש שעות מתמטיקה ביום, בארבע כיתות שונות, ובין לבין יש לי קבוצת תגבור לילדים חלשים. אני לא מחנכת, בכוונה, כי המתמטיקה זה מה שאני יודעת לעשות, ואני חושבת שילד שמצליח במתמטיקה מצליח בכלל. אחרי הצהריים אני לפעמים נותנת שיעורים פרטיים לילדים מהשכונה, בחינם לחלק, וזה עוד חלק של היום שהוא לא ממש עבודה ולא ממש לא.</w:t>
+        <w:t xml:space="preserve">אני באתי להוראה מהמתמטיקה, לא מהחינוך. באוקראינה למדתי מתמטיקה, עליתי בגיל עשרים ושתיים, ובהתחלה עבדתי במפעל כי לא הייתה עברית. אחרי כמה שנים עשיתי הסבה להוראה במכללה, ולימדתי שנתיים ברמלה. לזבולון הגעתי לפני שבע עשרה שנים כי עברנו לגור בגני אביב, ורציתי ללמד במקום שאני גרה בו. היום אני לא בטוחה שזה היה רעיון טוב, אבל אני לא אעזוב. יום רגיל מתחיל בזה שאני הולכת ברגל לבית הספר ופוגשת בדרך חמישה הורים לפחות, ובשנים האחרונות גם הורים ערבים מהבניין ממול, שמברכים אותי "בוקר טוב, המורה" בעברית טובה משלי. בבית הספר אני מלמדת שש שעות מתמטיקה ביום, בארבע כיתות שונות, ובין לבין יש לי קבוצת תגבור לילדים חלשים. אני לא מחנכת, בכוונה, כי המתמטיקה זה מה שאני יודעת לעשות, ואני חושבת שילד שמצליח במתמטיקה מצליח בכלל. אחרי הצהריים אני לפעמים נותנת שיעורים פרטיים לילדים מהשכונה, בחינם לחלק, וזה עוד חלק של היום שהוא לא ממש עבודה ולא ממש לא.</w:t>
       </w:r>
     </w:p>
     <w:p>
@@ -619,7 +619,7 @@
           <w:szCs w:val="24"/>
           <w:rtl/>
         </w:rPr>
-        <w:t xml:space="preserve">קהילה בשבילי זה השכונה, הבניינים, האנשים שאני פוגשת בחנות. אני לא חושבת על זה כמשהו של בית הספר. בית הספר הוא חלק מהקהילה, לא ההפך. שייכים אליה כל מי שגר פה, גם מי שאין לו ילדים בבית הספר: הסבים, השכנים, הפנסיונרים שיושבים על הספסלים. אני יודעת שבחדר המורים מדברים על "הקהילה הבית ספרית", ואני לא ממש מבינה מה זה. יש ילדים, יש הורים, יש מורים, וכולם גרים באותו מקום או לא. מה שכן, אני חושבת שבגני אביב יש כמה קהילות ולא אחת. יש הקהילה של דוברי הרוסית, שאני חלק ממנה, ויש לה החיים שלה: החנויות, החוגים, המרפאה, הקבוצות. יש הקהילה האתיופית, שהיא יותר סגורה. ויש הדתיים החדשים. בית הספר הוא המקום היחיד שכולם חייבים להיפגש בו, אז אולי במובן הזה הוא כן מייצר משהו. אבל קהילה אמיתית, כזאת שעוזרת אחת לשנייה בלי שמישהו ארגן, זה קיים אצל הרוסים וקיים אצל האתיופים, ולא כל כך בין כולם ביחד.</w:t>
+        <w:t xml:space="preserve">קהילה בשבילי זה השכונה, הבניינים, האנשים שאני פוגשת בחנות. אני לא חושבת על זה כמשהו של בית הספר. בית הספר הוא חלק מהקהילה, לא ההפך. שייכים אליה כל מי שגר פה, גם מי שאין לו ילדים בבית הספר: הסבים, השכנים, הפנסיונרים שיושבים על הספסלים, והמשפחה הערבית מהקומה השנייה שהבת שלה אצלי בכיתה ה'. אני יודעת שבחדר המורים מדברים על "הקהילה הבית ספרית", ואני לא ממש מבינה מה זה. יש ילדים, יש הורים, יש מורים, וכולם גרים באותו מקום או לא. מה שכן, אני חושבת שבגני אביב יש כמה קהילות ולא אחת. יש הקהילה של דוברי הרוסית, שאני חלק ממנה, ויש לה החיים שלה: החנויות, החוגים, המרפאה, הקבוצות. יש הקהילה האתיופית, שהיא יותר סגורה. יש הדתיים החדשים. ויש הערבים, שהגיעו בעשר השנים האחרונות, משפחות צעירות ומשכילות שברחו מהשכונות הוותיקות, ושיש להם קהילה משלהם בשכונה, עם המכולת שלהם והקרובים שלהם בבניינים הסמוכים. בית הספר הוא המקום היחיד שכולם חייבים להיפגש בו, אז אולי במובן הזה הוא כן מייצר משהו. אבל קהילה אמיתית, כזאת שעוזרת אחת לשנייה בלי שמישהו ארגן, זה קיים אצל הרוסים וקיים אצל הערבים וקיים אצל האתיופים, ולא כל כך בין כולם ביחד. ומה שאני כן רואה הוא שהילדים חוצים את הגבולות שההורים לא חוצים. הילדים הערבים והרוסים של הבניין שלי משחקים כדורגל ביחד כל אחר צהריים בחניה, והאימהות עומדות במרפסות ולא מדברות.</w:t>
       </w:r>
     </w:p>
     <w:p>
@@ -655,7 +655,7 @@
           <w:szCs w:val="24"/>
           <w:rtl/>
         </w:rPr>
-        <w:t xml:space="preserve">השכונה שלי, אני יכולה לתאר אותה מבפנים. היא נבנתה בשנות התשעים, מהר, בניינים של שמונה קומות אחד ליד השני, בשביל העולים. אני הייתי בין הראשונים. אז היו רק עולים, ובעברית לא שמעו ברחוב. היום זה אחרת: הילדים של העולים כבר ישראלים לגמרי, הסבים נשארו רוסים, והגיעו עוד אנשים. ההורים שאני פוגשת בבית הספר הם בעיקר הדור השני: הם נולדו שם, גדלו פה, מדברים עברית בבית ורוסית עם הסבתא. הם עובדים הרבה, הרבה בנתב"ג, בהייטק הקטן ברמלה, בחנויות. יש גם משפחות יוצאות אתיופיה, בבניינים הוותיקים, שקטות מאוד, והילדים שלהם אצלי במתמטיקה מצוינים לפעמים ולפעמים מאוד מאחור, בלי אמצע. והגרעין התורני, שהביא לשכונה משפחות צעירות עם הרבה ילדים, גן, בית כנסת, ופעילויות. השכונה מרגישה היום יותר חיה ויותר מתוחה. חיה כי יש ילדים ברחוב, ומתוחה כי כל קבוצה מרגישה שהשכונה שלה ושהשנייה לוקחת אותה.</w:t>
+        <w:t xml:space="preserve">השכונה שלי, אני יכולה לתאר אותה מבפנים. היא נבנתה בשנות התשעים, מהר, בניינים של שמונה קומות אחד ליד השני, בשביל העולים. אני הייתי בין הראשונים. אז היו רק עולים, ובעברית לא שמעו ברחוב. היום זה אחרת: הילדים של העולים כבר ישראלים לגמרי, הסבים נשארו רוסים, והגיעו עוד אנשים. ההורים שאני פוגשת בבית הספר הם בעיקר הדור השני: נולדו שם, גדלו פה, מדברים עברית בבית ורוסית עם הסבתא. יש משפחות יוצאות אתיופיה, בבניינים הוותיקים, שקטות מאוד. והגרעין התורני, שהביא לשכונה משפחות צעירות עם הרבה ילדים, גן, בית כנסת, ופעילויות. ובעשור האחרון, בכל בניין כמעט, משפחות ערביות. בהתחלה זה היה משפחה אחת פה ואחת שם, והיום בבניין שלי יש ארבע משפחות ערביות מתוך שש עשרה דירות. אלה אנשים שעובדים: אחות, מהנדס, עובד נתב"ג, מורה. הם באו כי בשכונות הערביות אין דירות ואין שקט, וכי רצו לילדים בית ספר עם תקציב ועם עברית. בכיתה ה' שלי יש שבעה ילדים ערבים, והם, כמעט כולם, בין החזקים במתמטיקה, כי ההורים שלהם באו לכאן כדי שהילדים יצליחו, וזה מרגיש לי מוכר מאוד. השכונה מרגישה היום יותר חיה ויותר מתוחה. חיה כי יש ילדים ברחוב, ומתוחה כי כל קבוצה מרגישה שהשכונה שלה ושהאחרת לוקחת אותה.</w:t>
       </w:r>
     </w:p>
     <w:p>
@@ -691,7 +691,7 @@
           <w:szCs w:val="24"/>
           <w:rtl/>
         </w:rPr>
-        <w:t xml:space="preserve">עם ההורים הקשר שלי שונה מזה של המחנכות, כי אני מורה מקצועית ואני גם שכנה. יש הורים שאני מכירה מהבניין, שיודעים איפה אני גרה, ודופקים לי בדלת בערב עם מחברת של הילד. בהתחלה זה הפריע לי, היום אני מקבלת את זה כחלק מהחיים כאן. ביום יום הקשר הוא דרך הציונים ודרך השיעורים הפרטיים, ועם ההורים דוברי הרוסית הוא קל לי, כי אני מדברת בשפה שלהם ומבינה מה הם רוצים: שהילד ידע, שיהיה סדר, שלא יפנקו אותו. עם הורים אחרים אני יותר זהירה, כי הם לפעמים מרגישים שאני קשוחה מדי. הקשר מתהדק כשילד מתחיל להצליח ואני אומרת את זה להורים, זה הרגע הכי טוב. והוא מתרופף כשהורה מבקש ממני טובה שאני לא יכולה לתת, ציון, או שלא אדווח על משהו, ואני מסרבת. ואז אני פוגשת אותו בסופר למחרת. זה המחיר של לגור בשכונה: אין "אחרי העבודה".</w:t>
+        <w:t xml:space="preserve">עם ההורים הקשר שלי שונה מזה של המחנכות, כי אני מורה מקצועית ואני גם שכנה. יש הורים שאני מכירה מהבניין, שיודעים איפה אני גרה, ודופקים לי בדלת בערב עם מחברת של הילד. בהתחלה זה הפריע לי, היום אני מקבלת את זה כחלק מהחיים כאן. עם ההורים דוברי הרוסית הקשר קל לי, כי אני מדברת בשפה שלהם ומבינה מה הם רוצים: שהילד ידע, שיהיה סדר, שלא יפנקו אותו. ועם ההורים הערבים גיליתי משהו שלא ציפיתי לו: הם רוצים בדיוק את אותו דבר. האבא של ראמי, מהנדס, בא אליי בשער ואמר "אני לא רוצה שיגידו לו שהוא טוב, אני רוצה שיגידו לו מה לא נכון", וזה בדיוק המשפט שהאבות הרוסים אומרים. אז בין ההורים הרוסים והערבים אצלי במתמטיקה יש ברית שלא כתובה: שניהם רוצים חמישים תרגילים, שניהם לא מאמינים ב"למידה חווייתית", ושניהם באים לערב הורים עם המחברת. הקשר מתהדק כשילד מתחיל להצליח ואני אומרת את זה להורים, זה הרגע הכי טוב. והוא מתרופף כשהורה מבקש ממני טובה שאני לא יכולה לתת, ציון, או שלא אדווח על משהו, ואני מסרבת. ואז אני פוגשת אותו בסופר למחרת. זה המחיר של לגור בשכונה: אין "אחרי העבודה". ועם האימהות הערביות שלא עובדות למדתי לדבר גם בעברית פשוטה ובידיים, כמו שדיברו איתי לפני שלושים שנה, וזה עובד.</w:t>
       </w:r>
     </w:p>
     <w:p>
@@ -727,7 +727,7 @@
           <w:szCs w:val="24"/>
           <w:rtl/>
         </w:rPr>
-        <w:t xml:space="preserve">כן, ויש לי דוגמה שאני אוהבת. לפני שנתיים התחלנו "מועדון מתמטיקה של סבים": הזמנתי סבים וסבתות, רובם מהנדסים ומורים לשעבר מברית המועצות, לבוא פעם בשבוע ולעזור לילדים בשיעורי בית במתמטיקה, בספרייה של בית הספר. באו שמונה. אחר כך שתים עשרה. זה היה מופלא, כי הסבים האלה יושבים בבית כל היום, לא מדברים עברית, מרגישים שהם לא שווים כלום פה, ופתאום ילד בן עשר שאינו נכד שלהם קורא להם "המורה". וילדים שבבית אין להם מי שיעזור קיבלו עזרה. והגיעו גם ילדים ממשפחות אתיופיות, ואז סבתא מאודסה הסבירה חילוק ארוך לילד מהבניין השלישי, בלי שפה משותפת, עם ידיים. ההנהלה בהתחלה פחדה, ביטוח, אחריות, אבל נתנה. זה עדיין קיים, פעם בשבוע, ובשבילי זה בדיוק מה שאני קוראת לו קהילה: אנשים מהשכונה שעושים משהו בשביל ילדים של אנשים אחרים מהשכונה, בתוך בית הספר, בלי שמישהו משלם. יש בסיפור הזה גם רגע שהיה קשה: אחד הסבים, מהנדס לשעבר, התחיל לתקן את המורות, להגיד לילדים "לא ככה מלמדים חילוק", ומחנכת אחת התלוננה. הייתי צריכה לשבת איתו ולהסביר, ברוסית, שהוא אורח ולא מורה, והוא נעלב ולא בא חודש. ואז חזר. למדתי מזה שכשפותחים את בית הספר לקהילה, הקהילה באה עם הדעות שלה, ושצריך מישהו שיעמוד בין שני הצדדים ויחזיק את הגבול בלי לסגור את הדלת. בשנה שעברה ההנהלה רצתה להפסיק את זה בגלל "בעיות ביטוח", ונלחמתי, והמועדון נשאר. אני חושבת שזה הדבר הכי חשוב שעשיתי בבית הספר הזה.</w:t>
+        <w:t xml:space="preserve">כן, ויש לי דוגמה שאני אוהבת. לפני שנתיים התחלתי "מועדון מתמטיקה של סבים": הזמנתי סבים וסבתות, רובם מהנדסים ומורים לשעבר מברית המועצות, לבוא פעם בשבוע ולעזור לילדים בשיעורי בית במתמטיקה, בספרייה של בית הספר. באו שמונה. אחר כך שתים עשרה. זה היה מופלא, כי הסבים האלה יושבים בבית כל היום, לא מדברים עברית, מרגישים שהם לא שווים כלום פה, ופתאום ילד בן עשר שאינו נכד שלהם קורא להם "המורה". והגיעו ילדים ממשפחות אתיופיות, וילדים ערבים, ואז סבתא מאודסה הסבירה חילוק ארוך לילד מהבניין השלישי, בלי שפה משותפת, עם ידיים. ואחרי חודשיים קרה משהו שלא תכננתי: סבא ערבי, מורה למתמטיקה לשעבר מלוד הישנה, שהנכדה שלו אצלי, ביקש להצטרף. הוא יושב היום ליד הסבים הרוסים, והם מדברים ביניהם מתמטיקה בעברית שבורה של שני הצדדים, ומתווכחים על שיטות. הסבים הרוסים אומרים שהוא "מלמד כמו שלימדו פעם", וזו המחמאה הכי גדולה שלהם. יש בסיפור הזה גם רגע קשה: אחד הסבים התחיל לתקן את המורות ומחנכת התלוננה, והייתי צריכה להסביר לו, ברוסית, שהוא אורח, והוא נעלב ולא בא חודש. ואז חזר. ובשנה שעברה ההנהלה רצתה להפסיק את זה בגלל "ביטוח", ונלחמתי, והמועדון נשאר. בשבילי זה בדיוק מה שאני קוראת לו קהילה: אנשים מהשכונה, מכל הקבוצות, שעושים משהו בשביל ילדים של אנשים אחרים מהשכונה, בתוך בית הספר, בלי שמישהו משלם.</w:t>
       </w:r>
     </w:p>
     <w:p>
@@ -763,7 +763,7 @@
           <w:szCs w:val="24"/>
           <w:rtl/>
         </w:rPr>
-        <w:t xml:space="preserve">המתח הגדול אצלי היה עם ההנהלה והמחנכות יותר מאשר עם ההורים. לפני כמה שנים בית הספר החליט לעבור לשיטת הוראה חדשה במתמטיקה, עם הרבה עבודה בקבוצות ופחות תרגול. ההורים דוברי הרוסית, שאני יודעת מה הם חושבים, התנגדו: הם רוצים שהילד יפתור חמישים תרגילים ויידע. ואני הסכמתי איתם. הייתי בעצם בצד של ההורים נגד בית הספר שלי, ואמרתי את זה בישיבת צוות, ואז הרגישו שאני "מייצגת את הרוסים" ולא את הצוות. זה היה מרחק לא נעים, בין השכונה שאני חלק ממנה לבין המקום שאני עובדת בו. והיה גם מתח אחר, בתקופת המלחמה, כשהורים ביקשו שהילדים ילמדו מרחוק ובית הספר התעקש על הגעה, ושוב אני הייתי באמצע: שכנה שמבינה את הפחד, ומורה שצריכה להיות בכיתה. מה שלמדתי זה שלגור בקהילה שאת מלמדת בה אומר שאת תמיד בשני צדדים. אני לא בטוחה שזה רע. אבל זה מעייף.</w:t>
+        <w:t xml:space="preserve">המתח הגדול אצלי היה עם ההנהלה והמחנכות יותר מאשר עם ההורים, סביב שיטת ההוראה במתמטיקה, ואני הייתי בצד של ההורים נגד בית הספר שלי. אבל המתח הכי קשה שהרגשתי בשכונה היה במאי 2021. בלילות ההם השכונה פחדה, אנשים ארגנו שמירה בבניינים, ובבניין שלי, עם ארבע משפחות ערביות, היה רגע שבו שכן יהודי אמר בקבוצת הבניין שצריך "לדעת מי גר פה". ואני, שגדלתי בברית המועצות בין עמים ששונאים זה את זה, זיהיתי את זה מהר ולא אהבתי. כתבתי בקבוצה שהמשפחה מהקומה השנייה היא זו ששמרה על הילדים שלי כשהייתי בבית חולים, וזה הפסיק את השיחה, לפחות בקבוצה. בבית הספר, באותו שבוע, הילדים הערבים לא הגיעו, ובכיתה ה' ילדים דיברו על "לנקום". אמרתי להם שמתמטיקה היא אותה מתמטיקה אצל כולם ושל הכפל אין לאום, וזה כל מה שידעתי להגיד, והיום אני חושבת שזה היה מעט מדי. מה שהשפיע עליי הוא שהבנתי שלגור בשכונה שאת מלמדת בה אומר שאת תמיד בשני צדדים: שכנה שמבינה את הפחד, ומורה שצריכה להחזיק כיתה שבה יושבים ילדים משני הצדדים של הפחד. אני לא בטוחה שזה רע. אבל זה מעייף, ובשבועות כאלה זה מפחיד.</w:t>
       </w:r>
     </w:p>
     <w:p>
@@ -799,7 +799,7 @@
           <w:szCs w:val="24"/>
           <w:rtl/>
         </w:rPr>
-        <w:t xml:space="preserve">בשכונה שלנו העיר המעורבת היא משהו ששומעים עליו ולא רואים. אין ערבים בגני אביב, חוץ מהפועלים בבניין ומהרופא בקופת חולים. הילדים שלי יודעים שלוד מעורבת כמו שהם יודעים שיש ים: זה קיים, זה לא פה. באירועים של 2021 זה השתנה לכמה שבועות. פחדו. סגרו את השכונה בלילה, הורים לא שלחו ילדים, ובכיתה ילדים אמרו דברים שלא רוצים לשמוע מילד בן עשר. אני, שגדלתי בברית המועצות בין עמים ששונאים זה את זה, זיהיתי את זה מהר, ולא אהבתי. ניסיתי להגיד בכיתה שמתמטיקה היא אותה מתמטיקה אצל כולם, ושל הכפל אין לאום, וזה כל מה שידעתי להגיד. אין לנו שום קשר עם בתי ספר ערבים, ואני לא מכירה אף מורה ערבייה בלוד, אחרי עשרים ושתיים שנים. זה אומר משהו. אם את שואלת אותי, העיר המעורבת היא לא חלק מהקהילה של בית הספר, היא חלק מהפחד של הקהילה, וזה לא אותו דבר.</w:t>
+        <w:t xml:space="preserve">בשכונה שלנו העיר המעורבת היא לא משהו ששומעים עליו, היא השכנים. בכל כיתה בבית הספר יש חמישה, שישה, שבעה ילדים ערבים, והם גרים באותם בניינים כמו כולם. אני רואה את זה קודם כול בשפה: ילד ערבי שהגיע לכיתה א' בלי עברית, ובכיתה ד' הוא פותר בעיות מילוליות טוב יותר מילדים שנולדו לתוך העברית, כי הוא למד את השפה בחצר, במתנ"ס, בכדורגל, ולא מספר. ואני רואה את זה במתמטיקה בצורה מצחיקה: הילדים הערבים כותבים את החשבון משמאל לימין כמו כולם, אבל כשהם מסבירים בקול הם לפעמים עוברים לערבית עם חבר ערבי, ואז ילד רוסי שואל "מה הוא אמר", ומתרגמים לו. ואני, שהייתי פעם הילדה שמתרגמים לה, יודעת בדיוק איך זה מרגיש. העיר המעורבת היא גם במתנ"ס: חוג הכדורגל, חוג השחמט שאני שולחת אליו ילדים, הם מעורבים, והאימהות יושבות על הספסל בחוץ, יהודיות בצד אחד וערביות בצד שני, והילדים בפנים על אותו מגרש. ואני רואה את זה במתחים: במאי 2021 ובמלחמה. ילד ערבי בכיתה ו' שאל אותי בתקופת המלחמה אם הוא "ישראלי", ולא ידעתי מה לענות לו, כי אני בעצמי שאלתי את זה על עצמי שלושים שנה. אם את שואלת אם העיר המעורבת היא חלק מהקהילה של בית הספר, התשובה היא כן, היא בכל כיתה, ובמובן הזה גני אביב היא אולי המקום היחיד בלוד שבו העירוב הוא יום יום ולא רעיון. מה שאין הוא קשר עם בתי הספר הערביים בעיר, ואני, אחרי עשרים ושתיים שנים, מכירה שם רק את הסבא מהמועדון.</w:t>
       </w:r>
     </w:p>
     <w:p>
@@ -835,7 +835,7 @@
           <w:szCs w:val="24"/>
           <w:rtl/>
         </w:rPr>
-        <w:t xml:space="preserve">בשבילי אין שער. אני גרה פה, אז התפקיד ממשיך לסופר, לבניין, לספסל ליד הגינה. הורים עוצרים אותי ברחוב לשאול על הילד, וילדים צועקים לי "המורה" מהחלון. אני נותנת שיעורים פרטיים בחינם לילדים שאני יודעת שהמשפחה לא יכולה לשלם, ואני לא רואה בזה התנדבות, אני רואה בזה שכנות. הקהילה מצפה ממני, כן, לדברים שלא כתובים: לתרגם מכתבים, להסביר לסבתא מה אומרים בבית הספר, לבוא לחגיגות. פעם בשנה לפחות מישהו מבקש ממני להתקשר "בתור מורה" למישהו שהם לא מצליחים לדבר איתו. אני חושבת שהתפקיד של מורה בקהילה כמו שלנו, של עולים, הוא קצת של מתווכת בין האנשים לבין המדינה. זה לא כתוב בשום מקום, ואף אחד לא משלם על זה, אבל אם לא אעשה את זה, מי יעשה. הבעיה היא שאין לי איפה להפסיק להיות מורה, ולפעמים אני נוסעת לים ברמלה רק כדי שאף אחד לא יזהה אותי.</w:t>
+        <w:t xml:space="preserve">בשבילי אין שער. אני גרה פה, אז התפקיד ממשיך לסופר, לבניין, לספסל ליד הגינה. הורים עוצרים אותי ברחוב לשאול על הילד, וילדים צועקים לי "המורה" מהחלון, בעברית, ברוסית, ולאחרונה גם "יא מועלמה" מהחלון ממול. אני נותנת שיעורים פרטיים בחינם לילדים שאני יודעת שהמשפחה לא יכולה לשלם, ואני לא רואה בזה התנדבות, אני רואה בזה שכנות. הקהילה מצפה ממני, כן, לדברים שלא כתובים: לתרגם מכתבים, להסביר לסבתא מה אומרים בבית הספר, לבוא לחגיגות. ובשנים האחרונות גם המשפחות הערביות בבניין מבקשות: לבדוק מכתב מהעירייה, לייעץ באיזה תיכון, ואני, שלא מדברת ערבית, מגלה שאני "המורה" של כולם בבניין, בלי קשר לשפה. אני חושבת שהתפקיד של מורה בקהילה כמו שלנו, של אנשים שהגיעו מבחוץ, עולים או ערבים מהעיר הישנה, הוא קצת של מתווכת בין האנשים לבין המדינה. זה לא כתוב בשום מקום, ואף אחד לא משלם על זה. הבעיה היא שאין לי איפה להפסיק להיות מורה, ולפעמים אני נוסעת לים ברמלה רק כדי שאף אחד לא יזהה אותי.</w:t>
       </w:r>
     </w:p>
     <w:p>
@@ -871,7 +871,7 @@
           <w:szCs w:val="24"/>
           <w:rtl/>
         </w:rPr>
-        <w:t xml:space="preserve">השייכות שלי היא לשכונה, ודרכה לבית הספר. אני מרגישה שייכת כשאני רואה ילד שלימדתי לפני חמש עשרה שנים עובד בבנק ברחוב הראשי ומברך אותי ברוסית, או כשאמא שהייתה בכיתה שלי מביאה את הבת שלה. זה דבר שמורות שגרות בחוץ לא מקבלות. מה שגורם לי להרגיש זרה הוא דווקא בבית הספר, בחדר המורים: הצוות צעיר ממני, רובו לא מהשכונה, ולפעמים אני מרגישה שהן מדברות על ההורים כמו על אנשים מבחוץ, "ההורים האלה", "הרוסים", ואני יושבת שם ואני "הרוסים". זה לא נאמר ברוע, אבל זה נאמר. והייתי אומרת שיש גם זרות מול העיר: לוד, העירייה, הכול שם מרגיש רחוק מהשכונה, כאילו גני אביב היא עיר בפני עצמה. אבל זרה בבית הספר אני לא מרגישה. אולי כי יש לי את הסבים בספרייה פעם בשבוע, ואז בית הספר הוא שלי.</w:t>
+        <w:t xml:space="preserve">השייכות שלי היא לשכונה, ודרכה לבית הספר. אני מרגישה שייכת כשאני רואה ילד שלימדתי לפני חמש עשרה שנים עובד בבנק ברחוב הראשי ומברך אותי ברוסית, או כשאמא שהייתה בכיתה שלי מביאה את הבת שלה. ובשנה האחרונה גם כשראמי, הילד הערבי מהקומה השנייה, הביא לי מהאמא שלו מעמול לחג, "כי המורה שלנו". מורות שגרות בחוץ לא מקבלות את זה. מה שגורם לי להרגיש זרה הוא דווקא בבית הספר, בחדר המורים: הצוות צעיר ממני, רובו לא מהשכונה, ולפעמים אני מרגישה שהן מדברות על ההורים כמו על אנשים מבחוץ, "הרוסים", "הערבים", "האלה מהבניינים", ואני יושבת שם ואני "הרוסים", והשכנים שלי הם "הערבים". זה לא נאמר ברוע, אבל זה נאמר. ויש גם זרות מול העיר: לוד, העירייה, הכול שם מרגיש רחוק מהשכונה, כאילו גני אביב היא עיר בפני עצמה. אבל זרה בבית הספר אני לא מרגישה. אולי כי יש לי את הסבים בספרייה פעם בשבוע, הרוסים והערבי, ואז בית הספר הוא שלי.</w:t>
       </w:r>
     </w:p>
     <w:p>
@@ -907,7 +907,7 @@
           <w:szCs w:val="24"/>
           <w:rtl/>
         </w:rPr>
-        <w:t xml:space="preserve">הייתי משנה את זה שהקהילה נכנסת לבית הספר רק כשקוראים לה. הייתי רוצה שהשכונה תוכל להשתמש בבית הספר אחרי שעות הלימודים: הספרייה, החצר, חדר המחשבים. יש פה פנסיונרים שאין להם איפה להיפגש, יש נוער שמסתובב בלי כלום, ובית הספר סגור בשלוש. אם הבניין הזה היה פתוח, הקהילה הייתה מרגישה שהוא שלה, ואז גם ההורים היו מתייחסים אליו אחרת, לא כמשרד שמזמנים אליהם אלא כבית. ולמה דווקא זה? כי אני רואה מה קורה עם הסבים: כשנותנים לאנשים להיכנס, הם באים, והם נותנים. את כל הפעילויות שבית הספר מארגן בשביל ההורים אפשר לבטל, ובמקום זה לפתוח דלת. אני יודעת שיש בעיה של שומר ושל ניקיון ושל מי אחראי. אבל בשכונה שבה הכול מרגיש של "העירייה", בית ספר פתוח היה המקום הראשון שמרגיש של האנשים.</w:t>
+        <w:t xml:space="preserve">הייתי משנה את זה שהקהילה נכנסת לבית הספר רק כשקוראים לה. הייתי רוצה שהשכונה תוכל להשתמש בבית הספר אחרי שעות הלימודים: הספרייה, החצר, חדר המחשבים. יש פה פנסיונרים שאין להם איפה להיפגש, יש נוער שמסתובב בלי כלום, ובית הספר סגור בשלוש. אם הבניין הזה היה פתוח, הקהילה הייתה מרגישה שהוא שלה, ואז גם ההורים היו מתייחסים אליו אחרת, לא כמשרד שמזמנים אליהם אלא כבית. ולמה דווקא זה? כי אני רואה מה קורה עם הסבים: כשנותנים לאנשים להיכנס, הם באים, והם נותנים, והסבא הערבי והסבים הרוסים מתווכחים על חילוק ארוך במקום שהנכדים שלהם יתווכחו על העיר. חצר בית ספר פתוחה בערב, עם מגרש, היא המקום שבו הילדים היהודים והערבים של השכונה היו משחקים ממילא, רק שהיום הם עושים את זה בחניה ליד המכוניות. אני יודעת שיש בעיה של שומר ושל ניקיון ושל מי אחראי. אבל בשכונה שבה הכול מרגיש של "העירייה", בית ספר פתוח היה המקום הראשון שמרגיש של האנשים, של כולם.</w:t>
       </w:r>
     </w:p>
     <w:p>
@@ -943,7 +943,7 @@
           <w:szCs w:val="24"/>
           <w:rtl/>
         </w:rPr>
-        <w:t xml:space="preserve">כן. תשאלי על השפה. כל מה שאמרתי על קהילה ועל הורים קשור לזה שאני מדברת רוסית. הורה שאני מדברת איתו בשפה שלו אומר לי דברים שהוא לא יגיד למחנכת. סבתא שאני מסבירה לה ברוסית מבינה למה הנכד צריך ללכת ליועצת. בלי השפה, הקהילה הזאת סגורה בפני בית הספר, והיא נראית מבחוץ כמו הורים שלא אכפת להם, וזה לא נכון. ועוד דבר: תשאלי מה קורה עם הילדים של העולים החדשים מאוקראינה, מהמלחמה שם. הם הגיעו בשנתיים האחרונות, כמה עשרות בשכונה, בלי עברית, בלי כלום, ובית הספר לא ממש ערוך. אני בשבילם קצת מה שמישהי הייתה בשבילי לפני שלושים שנה. אם מחקר על קהילה לא יראה אותם, הוא יפספס את מי שהכי צריך קהילה. אני רואה אותם בבוקר בשער, עם ההורים שלא מבינים מה אומרים להם, ואני ניגשת ומתרגמת, ובית הספר לא ביקש ממני ולא יודע. זה קורה כל יום, בשקט, בין מורה אחת לבין משפחה אחת. אולי זאת הקהילה האמיתית: לא מה שמארגנים, אלא מה שקורה בשער בשבע וחצי כשמישהו רואה מישהו.</w:t>
+        <w:t xml:space="preserve">כן. תשאלי על השפה. כל מה שאמרתי על קהילה ועל הורים קשור לזה שאני מדברת רוסית. הורה שאני מדברת איתו בשפה שלו אומר לי דברים שהוא לא יגיד למחנכת. בלי השפה, הקהילה הזאת סגורה בפני בית הספר, והיא נראית מבחוץ כמו הורים שלא אכפת להם, וזה לא נכון. ואותו דבר בדיוק נכון היום לגבי המשפחות הערביות: אין בבית הספר אף איש צוות שמדבר ערבית, לא מחנכת, לא יועצת, לא מזכירה, וההורים הערבים מקבלים את כל ההודעות בעברית ומתרגמים לסבתא, בדיוק כמו שאני תרגמתי לאמא שלי. אני רואה את עצמי בהם, ואני רואה איך בית הספר לא רואה אותם, כמו שלא ראה אותנו. ועוד דבר: תשאלי מה קורה עם הילדים של העולים החדשים מאוקראינה, מהמלחמה שם, שהגיעו בשנתיים האחרונות בלי עברית, ושיושבים בכיתה ליד ילדים ערבים שגם הם למדו עברית מאפס לפני שלוש שנים. ראיתי ילד ערבי מלמד ילד מאוקראינה את המילים הראשונות שלו בעברית, בהפסקה. זה גני אביב. אם מחקר על קהילה לא יראה את זה, הוא יפספס את הדבר הכי יפה שקורה פה.</w:t>
       </w:r>
     </w:p>
     <w:p>
@@ -1001,7 +1001,7 @@
           <w:szCs w:val="24"/>
           <w:rtl/>
         </w:rPr>
-        <w:t xml:space="preserve">הריאיון נערך בבית קפה במודיעין, משך ההקלטה 49 דקות.</w:t>
+        <w:t xml:space="preserve">הריאיון נערך בבית קפה במודיעין, משך ההקלטה 53 דקות.</w:t>
       </w:r>
     </w:p>
     <w:p>
@@ -1037,7 +1037,7 @@
           <w:szCs w:val="24"/>
           <w:rtl/>
         </w:rPr>
-        <w:t xml:space="preserve">תמיד רציתי להיות מורה, מכיתה ב' בערך, כי הייתה לי מורה לאנגלית שהייתי רוצה להיות כמוה. למדתי הוראת אנגלית במכללה, ובשנה האחרונה של הלימודים עשיתי התנסות בגני אביב. המנהלת הציעה לי משרה בסוף השנה, ונשארתי. שמונה שנים. זה בית הספר היחיד שעבדתי בו, אז אין לי השוואה, ואני חושבת שזה חשוב להגיד. יום רגיל אצלי מתחיל בנסיעה של ארבעים דקות ממודיעין, שהיא הזמן היחיד ביום שאני לבד. אחר כך חמש או שש שעות אנגלית, בכיתות ג' עד ו', וכרכזת חברתית אני אחראית גם על הטקסים, על מועצת התלמידים, על הימים המיוחדים ועל הקשר עם ועד ההורים המוסדי. אז בין השיעורים אני רצה: לסדר את הטקס, לדבר עם הורה שמתנדב, לבדוק מי מביא מה. אחר הצהריים זה ישיבות ותכנון, ובערב אני בבית במודיעין, רחוק מספיק כדי לא לפגוש אף הורה. אני אוהבת את העבודה, אבל אני מרגישה שהחלק של האנגלית הולך ומתכווץ והחלק של "לארגן" הולך וגדל.</w:t>
+        <w:t xml:space="preserve">תמיד רציתי להיות מורה, מכיתה ב' בערך, כי הייתה לי מורה לאנגלית שהייתי רוצה להיות כמוה. למדתי הוראת אנגלית במכללה, ובשנה האחרונה של הלימודים עשיתי התנסות בגני אביב. המנהלת הציעה לי משרה בסוף השנה, ונשארתי. שמונה שנים. זה בית הספר היחיד שעבדתי בו, אז אין לי השוואה, ואני חושבת שזה חשוב להגיד. יום רגיל אצלי מתחיל בנסיעה של ארבעים דקות ממודיעין, שהיא הזמן היחיד ביום שאני לבד. אחר כך חמש או שש שעות אנגלית, בכיתות ג' עד ו', וכרכזת חברתית אני אחראית גם על הטקסים, על מועצת התלמידים, על הימים המיוחדים ועל הקשר עם ועד ההורים המוסדי. בכיתות שלי יש בכל אחת חמישה או שישה ילדים ערבים מהשכונה, וזה משנה את השיעור שלי בצורה שלא חשבתי עליה כשלמדתי: אני מלמדת אנגלית לילדים שחלקם לומדים אותה כשפה שלישית, אחרי ערבית ועברית, וחלקם כשפה שנייה אחרי רוסית. בין השיעורים אני רצה: לסדר את הטקס, לדבר עם הורה שמתנדב, לבדוק מי מביא מה. בערב אני בבית במודיעין, רחוק מספיק כדי לא לפגוש אף הורה. אני אוהבת את העבודה, אבל אני מרגישה שהחלק של האנגלית הולך ומתכווץ והחלק של "לארגן" הולך וגדל.</w:t>
       </w:r>
     </w:p>
     <w:p>
@@ -1073,7 +1073,7 @@
           <w:szCs w:val="24"/>
           <w:rtl/>
         </w:rPr>
-        <w:t xml:space="preserve">כשאני שומעת "קהילה" אני חושבת קודם כול על ועד ההורים, כי זה מה שאני פוגשת כרכזת חברתית, ואז על כל ההורים, ואז על הילדים. והאמת שאני גם חושבת על הצוות, כי בשבילי, שלא גרה בלוד, הצוות הוא הקהילה היחידה שיש לי בבית הספר. מי שייך? זו שאלה שאני לא בטוחה שיש לי תשובה אחת עליה. פורמלית, כולם: הורים, ילדים, צוות, גם השכונה. בפועל, הקהילה שאני פוגשת היא ההורים שמגיעים: אותם עשרים הורים שמתנדבים בכל אירוע, שעונים בקבוצות, שיושבים בוועד. יש מאות הורים אחרים שאני לא יודעת איך הם נראים. אז יש פער בין הקהילה שיש לנו על הנייר לבין הקהילה שיש לנו בפועל. ואני חושבת שחלק מהעבודה שלי כרכזת חברתית הוא בדיוק להקטין את הפער הזה, ולא רק לארגן טקסים לעשרים ההורים שתמיד באים.</w:t>
+        <w:t xml:space="preserve">כשאני שומעת "קהילה" אני חושבת קודם כול על ועד ההורים, כי זה מה שאני פוגשת כרכזת חברתית, ואז על כל ההורים, ואז על הילדים. והאמת שאני גם חושבת על הצוות, כי בשבילי, שלא גרה בלוד, הצוות הוא הקהילה היחידה שיש לי בבית הספר. מי שייך? פורמלית, כולם: הורים, ילדים, צוות, גם השכונה. בפועל, הקהילה שאני פוגשת היא ההורים שמגיעים: אותם עשרים הורים שמתנדבים בכל אירוע, שעונים בקבוצות, שיושבים בוועד. יש מאות הורים אחרים שאני לא יודעת איך הם נראים. ובשמונה שנים ראיתי את הקהילה הזאת משתנה: בוועד ההורים של השנה יושבות לראשונה שתי אימהות ערביות, אחת מהן רוקחת, שהגיעה ואמרה "הילדים שלנו חמישית מהכיתות, אז מגיע לנו להיות בשולחן". היא צדקה, ואני התביישתי שלא חשבתי על זה בעצמי. אז הקהילה של בית הספר, בעיניי, היא לא רק מי ששייך אלא מי שמרגיש שמותר לו להגיע, ויש פער בין השניים. חלק מהעבודה שלי כרכזת חברתית הוא בדיוק להקטין את הפער הזה, ולא רק לארגן טקסים לעשרים ההורים שתמיד באים, ובשנתיים האחרונות הבנתי שהפער הזה הוא קודם כול בין האימהות הרוסיות שמארגנות את הכול לבין האימהות הערביות והאתיופיות שלא נכנסות לחדר.</w:t>
       </w:r>
     </w:p>
     <w:p>
@@ -1109,7 +1109,7 @@
           <w:szCs w:val="24"/>
           <w:rtl/>
         </w:rPr>
-        <w:t xml:space="preserve">בית הספר שלנו משרת בעיקר את החלק הדרומי של גני אביב, ושם יש הרבה בניינים חדשים יחסית, עם משפחות צעירות שהגיעו מהמרכז בגלל המחירים, לצד משפחות ותיקות דוברות רוסית ומשפחות יוצאות אתיופיה בבניינים הישנים. בשנים האחרונות הגיעו גם משפחות דתיות. התחושה שלי היא של שכונה בתנועה: כל שנה יש כיתה שלמה של ילדים חדשים שהגיעו ממקום אחר, וכיתה של ילדים שעזבו. ההורים עובדים הרבה, הרבה מהם בנתב"ג ובאזורי התעשייה, וחלק גדול מהילדים נמצאים בצהרונים עד ארבע וחמש. זו שכונה שאין בה הרבה: מרכז מסחרי, גינות, מתנ"ס קטן, ובית הספר. מבחינת הילדים, אני רואה פערים גדולים: ילדים שנוסעים לחו"ל בחופש וילדים שלא יצאו מלוד, באותה כיתה. באנגלית זה בולט במיוחד, כי יש ילדים שמדברים אנגלית מהבית ויש כאלה ששומעים אותה בפעם הראשונה אצלי.</w:t>
+        <w:t xml:space="preserve">בית הספר שלנו משרת בעיקר את החלק הדרומי של גני אביב, ושם יש הרבה בניינים חדשים יחסית, עם משפחות צעירות שהגיעו מהמרכז בגלל המחירים, לצד משפחות ותיקות דוברות רוסית ומשפחות יוצאות אתיופיה בבניינים הישנים. בשנים האחרונות הגיעו גם משפחות דתיות, והגיעו משפחות ערביות, הרבה: זוגות צעירים מהשכונות הערביות של לוד, לפעמים גם מרמלה, בדרך כלל עם מקצוע, שעברו לכאן בשביל דירה בבניין עם מעלית ובשביל בית ספר שיש בו חדר מחשבים. בכל כיתה אצלנו יש חמישה או שישה ילדים ערבים, ובכיתות הצעירות יותר. התחושה שלי היא של שכונה בתנועה: כל שנה יש כיתה שלמה של ילדים חדשים שהגיעו ממקום אחר, וכיתה של ילדים שעזבו. ההורים עובדים הרבה, הרבה מהם בנתב"ג ובאזורי התעשייה, וחלק גדול מהילדים נמצאים בצהרונים ובחוגים במתנ"ס עד ארבע וחמש, וזה המקום שבו הילדים היהודים והערבים של השכונה מבלים יחד יותר שעות מאשר בבית הספר. מבחינת הילדים, אני רואה פערים גדולים: ילדים שנוסעים לחו"ל בחופש וילדים שלא יצאו מלוד, באותה כיתה. ובאנגלית, ילדים שמדברים אנגלית מהבית וילדים ששומעים אותה בפעם הראשונה אצלי. ומה שהפתיע אותי הוא שהילדים הערבים הם לא בקבוצה החלשה: הורים שעברו שכונה בשביל חינוך הם הורים שבודקים שיעורי בית.</w:t>
       </w:r>
     </w:p>
     <w:p>
@@ -1145,7 +1145,7 @@
           <w:szCs w:val="24"/>
           <w:rtl/>
         </w:rPr>
-        <w:t xml:space="preserve">הקשר שלי עם הורים הוא שני סוגים. כמורה לאנגלית, הוא דל: ערב הורים, הודעה על מבחן, לפעמים שיחה על ילד שמתקשה. כרכזת חברתית, הוא צפוף מאוד, אבל עם קבוצה קטנה: ועד ההורים, ההורים המתנדבים, אימהות שמארגנות. איתם אני בקשר כמעט יומי בוואטסאפ, ולפעמים זה מרגיש יותר כמו ניהול פרויקט מאשר חינוך. הקשר מתהדק סביב אירועים גדולים: הטקס של כיתות ו', יום המשפחה, יריד הספרים. בשבועות האלה ההורים ואני צוות אחד. הוא מתרופף כשיש ויכוח על כסף: תשלומי הורים, מתנות למורים, מי משלם על האוטובוס. ויכוחים על כסף הורסים לי כל שנה משהו מהאמון. ומה שקשה לי יותר מכול הוא ההורים שאני לא מגיעה אליהם: האבא שאף פעם לא ראיתי, האמא שלא פותחת את ההודעות. אני עושה כל שנה "יום הורים פתוח" במיוחד בשבילם, ובאים אותם עשרים. אני עדיין מחפשת את הדרך.</w:t>
+        <w:t xml:space="preserve">הקשר שלי עם הורים הוא שני סוגים. כמורה לאנגלית, הוא דל: ערב הורים, הודעה על מבחן, לפעמים שיחה על ילד שמתקשה. כרכזת חברתית, הוא צפוף מאוד, אבל עם קבוצה קטנה: ועד ההורים, ההורים המתנדבים, אימהות שמארגנות. הקשר מתהדק סביב אירועים גדולים: הטקס של כיתות ו', יום המשפחה, יריד הספרים. הוא מתרופף כשיש ויכוח על כסף: תשלומי הורים, מתנות למורים, מי משלם על האוטובוס. ומה שלמדתי בשנים האחרונות הוא שיש הורים שאני לא מגיעה אליהם לא בגלל שהם לא רוצים, אלא בגלל שהמסגרת שלי לא מתאימה להם. ההורים הערבים, למשל: בשנה הראשונה הזמנתי לאירוע ערב "חגיגת חנוכה" וקיבלתי בחזרה שתיקה מארבע משפחות, ורק אחרי שאמא אחת אמרה לי בעדינות שהיא לא בטוחה אם זה "גם בשבילם" הבנתי מה עשיתי. מאז, לכל אירוע כיתתי יש שם שמתאים לכולם, ובחגים של כולם יש מקום. היום האמא הרוקחת מהוועד היא זו שמעירה לי כשאני מפספסת, ואני מודה לה בכל פעם. והקשר שאני הכי גאה בו נוצר בין שתי אימהות, רוסייה וערבייה, שהילדים שלהן באותה קבוצת כדורגל במתנ"ס: הן התחילו לעשות הסעות משותפות, והיום הן מנהלות יחד את ועד הכיתה של כיתה ד'. אני רק הושבתי אותן באותו שולחן ביום המשפחה. את השאר הן עשו.</w:t>
       </w:r>
     </w:p>
     <w:p>
@@ -1181,7 +1181,7 @@
           <w:szCs w:val="24"/>
           <w:rtl/>
         </w:rPr>
-        <w:t xml:space="preserve">כן, יום המשפחה בשנה שעברה. במקום הטקס הרגיל, ביקשנו מכל משפחה להביא תמונה אחת מהבית ולספר עליה. שמנו שולחנות בחצר, ובכל שולחן ישבו ארבע משפחות שלא מכירות אחת את השנייה, בכוונה. לא היה במה, לא היה מיקרופון. וזה עבד. ראיתי אבא ממשפחה דתית ואמא ממשפחה דוברת רוסית מדברים חצי שעה על תמונה של סבתא, ואמא יוצאת אתיופיה שהביאה תמונה מהמסע לישראל וכל השולחן שתק. ילדים הראו להורים של ילדים אחרים את הכיתה שלהם. אני עמדתי בצד ולא היה לי מה לעשות, וזה היה הרגע הכי טוב שלי כרכזת. הגיעו מאתיים משפחות, הרבה יותר מכל טקס. מה שנשאר מזה הוא שבשנה הזאת נרשמו לוועד שלוש אימהות שלא היו בו אף פעם, ואחת מהן היא אמא שלא דיברה איתי במשך חמש שנים. אני חושבת שמה שקרה שם הוא שההורים הפסיקו להיות קהל והפכו למשתתפים, וזה ההבדל כולו.</w:t>
+        <w:t xml:space="preserve">כן, יום המשפחה בשנה שעברה. במקום הטקס הרגיל, ביקשנו מכל משפחה להביא תמונה אחת מהבית ולספר עליה. שמנו שולחנות בחצר, ובכל שולחן ישבו ארבע משפחות שלא מכירות אחת את השנייה, בכוונה, ודאגתי שבכל שולחן יהיו משפחות מקבוצות שונות. לא היה במה, לא היה מיקרופון. וזה עבד. ראיתי אבא ממשפחה דתית ואמא ממשפחה דוברת רוסית מדברים חצי שעה על תמונה של סבתא, ואמא יוצאת אתיופיה שהביאה תמונה מהמסע לישראל וכל השולחן שתק. בשולחן אחר, אבא ערבי הביא תמונה של בית סבא שלו בלוד הישנה, בניין שעדיין עומד ליד השוק, ואבא יהודי מהשולחן אמר "אני עובר שם כל יום", והם קבעו ללכת יחד. אני לא יודעת אם הלכו. ילדים הראו להורים של ילדים אחרים את הכיתה שלהם. אני עמדתי בצד ולא היה לי מה לעשות, וזה היה הרגע הכי טוב שלי כרכזת. הגיעו מאתיים משפחות, הרבה יותר מכל טקס, ובהן כמעט כל המשפחות הערביות, שבטקסים רגילים כמעט לא מגיעות. מה שנשאר מזה הוא שבשנה הזאת נרשמו לוועד שלוש אימהות שלא היו בו אף פעם, שתיים מהן ערביות ואחת שלא דיברה איתי במשך חמש שנים. אני חושבת שמה שקרה שם הוא שההורים הפסיקו להיות קהל והפכו למשתתפים, וכשאתה משתתף, לא משנה באיזו שפה אתה שותק.</w:t>
       </w:r>
     </w:p>
     <w:p>
@@ -1217,7 +1217,7 @@
           <w:szCs w:val="24"/>
           <w:rtl/>
         </w:rPr>
-        <w:t xml:space="preserve">היה, ואני עדיין מרגישה את זה. לפני שנה וחצי הייתה תלונה של הורה על מורה בבית הספר, ותוך יומיים זה היה בכל קבוצות הוואטסאפ של השכונה, עם שמות, עם פרטים, עם דברים שלא נכונים. ההנהלה ביקשה מהצוות לא להגיב, ואני, כמי שבקשר עם ההורים, קיבלתי עשרות הודעות ולא יכולתי לענות. הרגשתי שההורים שאני עובדת איתם כל השנה הפכו ברגע לצד השני. יצאתי מזה פגועה, ולקח לי חודשים לחזור לדבר עם חלק מהם. מה שהבנתי הוא שהקהילה, זאת שאנחנו כל כך רוצים לבנות, יכולה להיות גם כוח שפועל נגד בית הספר כשהיא מרגישה שלא מספרים לה. ואולי הטעות הייתה השתיקה. היום אני חושבת שאם ההנהלה הייתה מזמנת את הוועד למחרת ומספרת מה אפשר, היינו מונעים חצי מהסיפור. מאז אני מקפידה, בכל דבר שקשור אליי, להקדים ולספר להורים לפני שהם שומעים ממישהו אחר. ויש עוד משהו שלמדתי מהסיפור הזה, על עצמי: גיליתי כמה אני תלויה באהבה של ההורים. כשהם היו איתי, הרגשתי שאני עושה את העבודה הכי טובה בעולם, וכשהם היו נגד, לא רציתי לקום בבוקר. זה לא בריא למורה, וזה גם לא בריא לקהילה, כי קהילה שאפשר לאבד אותה בשבוע אחד של וואטסאפ היא לא באמת קהילה, היא קהל. היום אני מנסה לבנות משהו איטי יותר: לא עשרים הורים שאוהבים אותי, אלא מאה הורים שמכירים אותי קצת. זה פחות מרגש, וזה מחזיק יותר.</w:t>
+        <w:t xml:space="preserve">היה, ואני עדיין מרגישה את זה. לפני שנה וחצי הייתה תלונה של הורה על מורה בבית הספר, ותוך יומיים זה היה בכל קבוצות הוואטסאפ של השכונה, עם שמות, עם פרטים, עם דברים שלא נכונים. ההנהלה ביקשה מהצוות לא להגיב, ואני, כמי שבקשר עם ההורים, קיבלתי עשרות הודעות ולא יכולתי לענות. הרגשתי שההורים שאני עובדת איתם כל השנה הפכו ברגע לצד השני. והיה מתח אחר, שקט יותר וקשה יותר, בתקופת המלחמה: בטקס יום הזיכרון, הורה אחד שאל אותי למה הילדים הערבים "עומדים בטקס שלנו", ובאותו שבוע אמא ערבייה שאלה אותי אם הבן שלה חייב להגיע, כי "הוא לא יודע איפה לשים את עצמו". שתי השאלות היו לגיטימיות, ואני עמדתי באמצע. מה שעשיתי: דיברתי עם מועצת התלמידים, שבה יש גם ילדים ערבים, ושאלתי אותם. הם הציעו שהטקס יכלול קטע על "ילדים בעיר שלנו", ושכל ילד שרוצה יעמוד, ומי שלא, יישב בכבוד. זה לא פתר את הכול, ושני ההורים לא היו מרוצים לגמרי. אבל הילדים היו. מה שלמדתי זה שהקהילה שאנחנו רוצים לבנות יכולה להתפרק בשבוע של וואטסאפ, ויכולה להיסדק בשאלה אחת בטקס, ושהדרך היחידה לעבור את זה היא לא לשתוק. היום אני מקדימה ומספרת להורים, לכולם, לפני כל טקס, מה יהיה בו ולמה.</w:t>
       </w:r>
     </w:p>
     <w:p>
@@ -1253,7 +1253,7 @@
           <w:szCs w:val="24"/>
           <w:rtl/>
         </w:rPr>
-        <w:t xml:space="preserve">האמת היא שבשמונה שנים בבית הספר, העובדה שלוד מעורבת כמעט לא נכנסה לכיתה שלי. אין לנו תלמידים ערבים ואין לנו קשר עם בתי ספר ערבים. אני רכזת חברתית, ובתוכנית החברתית שלנו אין שום פעילות שקשורה לזה, ואני אומרת את זה עם אי נוחות. זה כן בא לידי ביטוי בשני מקומות. הראשון, אחרי מאי 2021, כשהשכונה פחדה והילדים הביאו את הפחד לכיתה, ועשינו שיחות כיתה על רגשות בלי לדבר על מה שקרה בעיר. השני, בטקסים: בכל פעם שאני בוחרת שיר או טקסט ליום מיוחד, אני שואלת את עצמי אם זה היה מתאים גם אם היו בכיתה ילדים ערבים, ואז אני נזכרת שאין. לפני שנה הייתה פנייה מהעירייה לפרויקט משותף של רכזות חברתיות מבתי ספר יהודיים וערביים. הלכתי לפגישה אחת. היו שם שתי רכזות מבתי ספר ערביים, ובפעם הראשונה דיברתי עם מורה ערבייה מלוד. הפרויקט לא יצא לפועל בסוף, בגלל המצב, אבל השיחה ההיא נשארה איתי. היא הייתה על אותם הורים, אותם ילדים, אותם צהרונים. זה הפתיע אותי, ולא היה צריך להפתיע.</w:t>
+        <w:t xml:space="preserve">בבית הספר שלנו לוד המעורבת יושבת בכיתה: חמישה, שישה ילדים ערבים בכל כיתה, ילדים שגרים בבניינים של השכונה, שהולכים לאותו מתנ"ס ולאותו חוג כדורגל ולאותה חנות ממתקים. באנגלית אני רואה את זה דרך השפה: ילד ערבי שהגיע לכיתה א' בלי עברית מדבר בכיתה ג' עברית של ילד מקומי, כי הוא למד אותה במגרש, בהפסקה, בצהרון. ובשיעור שלי, כשאני מסבירה מילה באנגלית, יש ילדים שמתרגמים לעצמם לעברית ויש שמתרגמים לערבית, ולפעמים ילד ערבי מתרגם לילד מאוקראינה שהגיע לא מזמן, ושניהם לומדים שתי שפות בבת אחת. כרכזת חברתית אני רואה את זה בטקסים ובחגים: בשנתיים האחרונות הוספנו ללוח השנה של בית הספר את הרמדאן ואת עיד אל-פיטר, ואמא ערבייה מגיעה לספר, ובחנוכה היא מביאה את הילד להדלקת נרות. ואני רואה את זה במתחים: במאי 2021, כשהילדים הערבים לא הגיעו שבוע וילדים יהודים אמרו דברים שלמדו בבית, ובמלחמה, כשילד שאבא שלו במילואים וילד שהדודים שלו בעזה יושבים באותה שורה בטקס. מה שאין לנו הוא קשר עם בתי הספר הערביים בעיר. לפני שנה הייתה פנייה מהעירייה לפרויקט משותף של רכזות חברתיות, והלכתי לפגישה אחת, ודיברתי בפעם הראשונה עם מורה ערבייה מלוד. גיליתי שחלק מהילדים הערבים שלי הם בני דודים של הילדים שלה, ושהם נפגשים בחגים ומספרים אחד לשני על בתי ספר שונים לגמרי. הפרויקט לא יצא לפועל בסוף, בגלל המצב, אבל זה נשאר איתי: העיר המעורבת כבר נמצאת בכיתה שלי, והעיר עצמה עוד לא יודעת.</w:t>
       </w:r>
     </w:p>
     <w:p>
@@ -1289,7 +1289,7 @@
           <w:szCs w:val="24"/>
           <w:rtl/>
         </w:rPr>
-        <w:t xml:space="preserve">אני חושבת שהתפקיד ממשיך מחוץ לשער, אבל אצלי הוא ממשיך דרך הטלפון ולא דרך הרגליים, כי אני לא גרה בלוד. אני לא פוגשת הורים בסופר ולא רואה את הילדים ברחוב, וזה אומר שאני מכירה את הקהילה בעיקר דרך מה שהיא בוחרת להראות לי בבית הספר. יש בזה יתרון: אני לא שופטת אף אחד לפי הבניין שהוא גר בו. ויש בזה חיסרון: כשהורה אומר לי "את לא מבינה איך זה פה", הוא צודק. הקהילה כן מצפה ממני לדברים שלא כתובים: להגיע לאירועים בערב, לענות בשישי, להיות בכל קבוצת וואטסאפ. ואני מצפה מעצמי לדעת מה קורה בשכונה, אז אני קוראת את קבוצות ההורים גם כשאני לא צריכה. הגבול שלי הוא גאוגרפי: ארבעים דקות נסיעה. מצד אחד זה שומר עליי. מצד שני, בשמונה שנים אני עדיין קצת אורחת, ואני חושבת שהורים מרגישים את זה.</w:t>
+        <w:t xml:space="preserve">אני חושבת שהתפקיד ממשיך מחוץ לשער, אבל אצלי הוא ממשיך דרך הטלפון ולא דרך הרגליים, כי אני לא גרה בלוד. אני לא פוגשת הורים בסופר ולא רואה את הילדים ברחוב, וזה אומר שאני מכירה את הקהילה בעיקר דרך מה שהיא בוחרת להראות לי בבית הספר. יש בזה יתרון: אני לא שופטת אף אחד לפי הבניין שהוא גר בו או לפי השפה שהוא מדבר בבית. ויש בזה חיסרון: כשהורה אומר לי "את לא מבינה איך זה פה", הוא צודק. הקהילה כן מצפה ממני לדברים שלא כתובים: להגיע לאירועים בערב, לענות בשישי, להיות בכל קבוצת וואטסאפ. ובשנה האחרונה הרגשתי ציפייה חדשה, משני הצדדים: שאהיה מי שיודעת מה עושים כשהעיר מתלקחת. הורים ערבים שאלו אותי אם "יהיה בסדר" לילד בבית הספר, והורים יהודים שאלו אם "יש מישהו ששומר". אני לא איש ביטחון ולא פסיכולוגית, אני מורה לאנגלית שמארגנת טקסים. אבל הבנתי שבעיר הזאת הרכזת החברתית היא מי שמחזיקה את החוט שבין הקבוצות, והחוט הזה לא נגמר בשער. הגבול שלי הוא גאוגרפי: ארבעים דקות נסיעה. מצד אחד זה שומר עליי. מצד שני, בשמונה שנים אני עדיין קצת אורחת, ואני חושבת שהורים, מכל הקבוצות, מרגישים את זה.</w:t>
       </w:r>
     </w:p>
     <w:p>
@@ -1325,7 +1325,7 @@
           <w:szCs w:val="24"/>
           <w:rtl/>
         </w:rPr>
-        <w:t xml:space="preserve">מה שנותן לי שייכות הוא הצוות, ובעיקר שלוש מורות שאיתן אני עובדת מההתחלה. אנחנו קוראות לעצמנו "הוותיקות הצעירות". ויש את הילדים: כיתת ו' שאני מלווה מכיתה ג', שאני יודעת עליהם הכול. ויש רגעים באירועים, כמו ביום המשפחה, שבהם אני מרגישה שבית הספר הזה הוא שלי אפילו שאני נוסעת ממנו הביתה למודיעין. מה שגורם לי להרגיש זרה הוא בעיקר מודיעין עצמה: כשאני מספרת לחברים איפה אני עובדת, יש פרצוף. "לוד?" ואני מוצאת את עצמי מגינה על השכונה שאני לא גרה בה. וגם ההורים, לפעמים, בעדינות: "את ממודיעין, נכון?" כאילו זה מסביר משהו. ויש את הרגעים שבהם ההורים מדברים ביניהם רוסית או אמהרית ואני לא חלק. אבל אם לסכם, אני מרגישה יותר שייכת לבית הספר הזה מאשר לעיר שאני גרה בה. אני רק לא בטוחה שבית הספר יודע את זה.</w:t>
+        <w:t xml:space="preserve">מה שנותן לי שייכות הוא הצוות, ובעיקר שלוש מורות שאיתן אני עובדת מההתחלה. אנחנו קוראות לעצמנו "הוותיקות הצעירות". ויש את הילדים: כיתת ו' שאני מלווה מכיתה ג', שאני יודעת עליהם הכול, ובה גם עדן וגם מוחמד, שהם החברים הכי טובים מאז הצהרון בכיתה א', ושהולכים יחד לכדורגל במתנ"ס כל יום שלישי. ויש רגעים באירועים, כמו ביום המשפחה, שבהם אני מרגישה שבית הספר הזה הוא שלי אפילו שאני נוסעת ממנו הביתה למודיעין. מה שגורם לי להרגיש זרה הוא בעיקר מודיעין עצמה: כשאני מספרת לחברים איפה אני עובדת, יש פרצוף. "לוד?" ואז "יש שם ערבים בכיתה?" כאילו זו בעיה. ואני מוצאת את עצמי מגינה על שכונה שאני לא גרה בה ועל כיתה שהיא הדבר הכי טוב שקרה לי. וגם ההורים, לפעמים, בעדינות: "את ממודיעין, נכון?" כאילו זה מסביר משהו. ויש את הרגעים שבהם ההורים מדברים ביניהם רוסית או ערבית או אמהרית ואני לא חלק. אבל אם לסכם, אני מרגישה יותר שייכת לבית הספר הזה מאשר לעיר שאני גרה בה. אני רק לא בטוחה שבית הספר יודע את זה.</w:t>
       </w:r>
     </w:p>
     <w:p>
@@ -1361,7 +1361,7 @@
           <w:szCs w:val="24"/>
           <w:rtl/>
         </w:rPr>
-        <w:t xml:space="preserve">הייתי משנה את האופן שבו אנחנו מודדים הצלחה בקשר עם הקהילה. היום הצלחה היא כמה הורים הגיעו לטקס. הייתי רוצה שהצלחה תהיה כמה הורים חדשים הגיעו, כלומר כאלה שלא היו בשנה שעברה. כי אם נמדוד את זה, נתחיל לעשות דברים אחרת: פחות טקסים גדולים, יותר שולחנות קטנים, פחות במה, יותר שיחה. יום המשפחה הראה לי שזה אפשרי. ולמה דווקא זה? כי אני חושבת שהבעיה של הקהילה בגני אביב היא לא שההורים לא רוצים, אלא שהמבנה שאנחנו מציעים להם, קהל מול במה, מתאים רק למי שכבר מרגיש בבית. הורה שמתבייש בעברית שלו, שעובד משמרות, שלא מכיר אף אחד, לא בא לטקס. הוא אולי יבוא לשולחן עם ארבע משפחות ותמונה אחת. אז השינוי שאני רוצה הוא לא תקציב ולא מבנה, הוא מה שאנחנו סופרים.</w:t>
+        <w:t xml:space="preserve">הייתי משנה את האופן שבו אנחנו מודדים הצלחה בקשר עם הקהילה. היום הצלחה היא כמה הורים הגיעו לטקס. הייתי רוצה שהצלחה תהיה כמה הורים חדשים הגיעו, כלומר כאלה שלא היו בשנה שעברה, ומאילו משפחות. כי אם נמדוד את זה, נתחיל לעשות דברים אחרת: פחות טקסים גדולים, יותר שולחנות קטנים, פחות במה, יותר שיחה, ופחות אירועים שיש להם שם של חג אחד. יום המשפחה הראה לי שזה אפשרי, ושהאימהות הערביות והאתיופיות, שלא באות לטקסים, באות לשולחן. ולמה דווקא זה? כי אני חושבת שהבעיה של הקהילה בגני אביב היא לא שההורים לא רוצים, אלא שהמבנה שאנחנו מציעים להם, קהל מול במה, מתאים רק למי שכבר מרגיש בבית. הורה שמתבייש בעברית שלו, שעובד משמרות, שלא בטוח אם האירוע "גם בשבילו", לא בא לטקס. הוא אולי יבוא לשולחן עם ארבע משפחות ותמונה אחת. אז השינוי שאני רוצה הוא לא תקציב ולא מבנה, הוא מה שאנחנו סופרים. ואם נספור נכון, נגלה שבית הספר שלנו הוא בית הספר המעורב היחיד בלוד, ושאף אחד לא קרא לו ככה.</w:t>
       </w:r>
     </w:p>
     <w:p>
@@ -1397,7 +1397,7 @@
           <w:szCs w:val="24"/>
           <w:rtl/>
         </w:rPr>
-        <w:t xml:space="preserve">כן, דבר אחד. אני חושבת שכדאי לשאול את המורות גם על הקהילה שלהן עצמן, לא רק על הקהילה של בית הספר. מורה שחיה בקהילה חזקה, עם משפחה קרובה, חברים, מקום, מביאה לבית הספר משהו אחר ממורה שחיה לבד בעיר אחרת. אני בשמונה שנים האלה בניתי את הקהילה שלי בתוך חדר המורים, וזה אומר שבית הספר הוא בשבילי גם מקום עבודה וגם המקום שבו יש לי אנשים. אני לא בטוחה שזה בריא, אבל זה נכון, ואני חושבת שזה נכון גם לגבי מורות אחרות, צעירות, שמגיעות מבחוץ. אם המחקר שואל מה בית הספר נותן לקהילה, שווה לשאול גם מה הקהילה של בית הספר נותנת למורות. ועוד משהו קטן, שחשבתי עליו רק עכשיו: רוב מה שסיפרתי לך על הורים היה על אימהות. האבות כמעט לא קיימים בסיפור שלי, חוץ מהאבא עם הפלוב ביום המשפחה. אני לא יודעת אם זה בגלל שעות העבודה שלהם או בגלל שבית הספר, בלי לשים לב, פונה לאימהות. אבל קהילה שחצי ממנה לא בתמונה היא לא כל הקהילה, ואולי שווה לשאול על זה.</w:t>
+        <w:t xml:space="preserve">כן, שני דברים. הראשון: כדאי לשאול את המורות גם על הקהילה שלהן עצמן, לא רק על הקהילה של בית הספר. מורה שחיה בקהילה חזקה מביאה לבית הספר משהו אחר ממורה שחיה לבד בעיר אחרת. אני בשמונה שנים האלה בניתי את הקהילה שלי בתוך חדר המורים, ואני לא בטוחה שזה בריא, אבל זה נכון גם לגבי מורות אחרות, צעירות, שמגיעות מבחוץ. השני, וזה חשוב לי יותר: אל תכתבי על בית הספר שלנו "בית ספר יהודי". תכתבי "בית ספר ממלכתי בשכונה מעורבת", כי זה מה שהוא. חמישית מהילדים שלי ערבים, ואין בבית הספר אף איש צוות שמדבר ערבית, אין שעת ערבית, ואין מי שחשב מה עושים עם זה. אני, רכזת חברתית בלי הכשרה לזה, ממציאה את הטקסים מחדש כל שנה עם האימהות. אם המחקר יראה את זה, אולי מישהו בעירייה או במשרד יקרא. ואם לא, לפחות ההורים הערבים שלי יראו שמישהו שם לב שהם קיימים.</w:t>
       </w:r>
     </w:p>
     <w:p>
@@ -1455,7 +1455,7 @@
           <w:szCs w:val="24"/>
           <w:rtl/>
         </w:rPr>
-        <w:t xml:space="preserve">הריאיון נערך בביתה של המרואיינת, משך ההקלטה 55 דקות.</w:t>
+        <w:t xml:space="preserve">הריאיון נערך בביתה של המרואיינת, משך ההקלטה 59 דקות.</w:t>
       </w:r>
     </w:p>
     <w:p>
@@ -1491,7 +1491,7 @@
           <w:szCs w:val="24"/>
           <w:rtl/>
         </w:rPr>
-        <w:t xml:space="preserve">הגעתי להוראה דרך החינוך הלא פורמלי: הייתי מדריכה בתנועת נוער, ואחר כך רכזת, והבנתי שאני רוצה להיות עם ילדים כל יום ולא רק בשבתות. למדתי במכללה דתית, לימדתי חמש שנים בבית ספר ממלכתי דתי בירושלים, ואז עברנו עם המשפחה ללוד, כחלק מהגרעין. הבחירה ללמד בבית ספר ממלכתי ולא דתי הייתה בכוונה: רציתי ללמד את הילדים של השכונה שאני גרה בה, לא רק את הילדים של החברים שלי. הגעתי לגני אביב לפני שש שנים, ומאז אני מחנכת. יום רגיל מתחיל אצלי בשש, עם חמשת הילדים שלי, ובשבע וחצי אני כבר בכיתה. אני מחנכת כיתה ו', שזה גיל שבו הכול קורה: הפרידה מבית הספר, הגוף שמשתנה, הטלפונים. רוב היום בכיתה שלי, והחלק הכי חשוב ביום הוא שעת החינוך, שבה אנחנו פשוט מדברים. אחרי הצהריים אני חוזרת הביתה ברגל, ובדרך פוגשת את הכיתה שלי ברחוב, כי הם גרים סביבי.</w:t>
+        <w:t xml:space="preserve">הגעתי להוראה דרך החינוך הלא פורמלי: הייתי מדריכה בתנועת נוער, ואחר כך רכזת, והבנתי שאני רוצה להיות עם ילדים כל יום ולא רק בשבתות. למדתי במכללה דתית, לימדתי חמש שנים בבית ספר ממלכתי דתי בירושלים, ואז עברנו עם המשפחה ללוד, כחלק מהגרעין. הבחירה ללמד בבית ספר ממלכתי ולא דתי הייתה בכוונה: רציתי ללמד את הילדים של השכונה שאני גרה בה, לא רק את הילדים של החברים שלי. ומה שלא ידעתי כשבאתי הוא שהילדים של השכונה כוללים גם ילדים ערבים, חמישה או שישה בכל כיתה, ושזה יהיה החלק המעניין ביותר בעבודה שלי. הגעתי לגני אביב לפני שש שנים, ומאז אני מחנכת. יום רגיל מתחיל אצלי בשש, עם חמשת הילדים שלי, ובשבע וחצי אני כבר בכיתה. אני מחנכת כיתה ו', שלושים ילדים, ובהם שישה ילדים ערבים, שבעה ילדים ממשפחות דוברות רוסית, שלושה מהגרעין, ושאר ישראל. זה גיל שבו הכול קורה: הפרידה מבית הספר, הגוף שמשתנה, הטלפונים, והשאלות הגדולות על מי אנחנו. רוב היום בכיתה שלי, והחלק הכי חשוב ביום הוא שעת החינוך, שבה אנחנו פשוט מדברים. אחרי הצהריים אני חוזרת הביתה ברגל, ובדרך פוגשת את הכיתה שלי ברחוב, כי הם גרים סביבי, כולם.</w:t>
       </w:r>
     </w:p>
     <w:p>
@@ -1527,7 +1527,7 @@
           <w:szCs w:val="24"/>
           <w:rtl/>
         </w:rPr>
-        <w:t xml:space="preserve">בשבילי "קהילה" זו מילה שאני חיה בתוכה, כי הגרעין שאני שייכת אליו נקרא קהילה. אז כשאני שומעת אותה בהקשר של בית הספר, אני צריכה לעצור ולחשוב: לא, זאת קהילה אחרת. הקהילה של בית הספר היא כל המשפחות של הילדים, ובגני אביב זה אומר מגוון אדיר, שרובו לא דומה לי בכלל. ואני חושבת שזה בדיוק העניין: הקהילה של בית הספר היא המקום היחיד שבו אני, כאישה דתייה מהגרעין, נמצאת באותו מעגל עם משפחה חילונית מאוקראינה ועם משפחה מסורתית מאתיופיה. שייכים אליה כולם: ההורים, הילדים, הצוות, ובעיניי גם מי שאין לו ילדים אבל גר בשכונה וקורה לו משהו כשבית הספר פורח. אני יודעת שיש כאלה בשכונה שחושבים שהגרעין רוצה "לקחת" את בית הספר. אני חושבת ההפך: אני רוצה שבית הספר יהיה של כולם, כי אני רוצה שהילדים שלי יגדלו במקום שבו כולם זה כולם.</w:t>
+        <w:t xml:space="preserve">בשבילי "קהילה" זו מילה שאני חיה בתוכה, כי הגרעין שאני שייכת אליו נקרא קהילה. אז כשאני שומעת אותה בהקשר של בית הספר, אני צריכה לעצור ולחשוב: לא, זאת קהילה אחרת. הקהילה של בית הספר היא כל המשפחות של הילדים, ובגני אביב זה אומר מגוון אדיר, שרובו לא דומה לי בכלל. ואני חושבת שזה בדיוק העניין: הקהילה של בית הספר היא המקום היחיד שבו אני, כאישה דתייה מהגרעין, נמצאת באותו מעגל עם משפחה חילונית מאוקראינה, עם משפחה מסורתית מאתיופיה, ועם משפחה מוסלמית מלוד הישנה שעברה לבניין ממול. שייכים אליה כולם: ההורים, הילדים, הצוות, ובעיניי גם מי שאין לו ילדים אבל גר בשכונה וקורה לו משהו כשבית הספר פורח. אני יודעת שיש כאלה בשכונה שחושבים שהגרעין רוצה "לקחת" את בית הספר, ואני יודעת שיש כאלה שחושבים שהמשפחות הערביות "לוקחות" את השכונה. אני חושבת ההפך על שני הדברים: אני רוצה שבית הספר יהיה של כולם, כי אני רוצה שהילדים שלי יגדלו במקום שבו כולם זה כולם. ואני אומרת את זה כמי שלימודי ארץ ישראל הם התחום שלה: קהילה בעיר הזאת היא לא מי שהיה פה קודם, היא מי שיושב בכיתה עכשיו.</w:t>
       </w:r>
     </w:p>
     <w:p>
@@ -1563,7 +1563,7 @@
           <w:szCs w:val="24"/>
           <w:rtl/>
         </w:rPr>
-        <w:t xml:space="preserve">השכונה שבית הספר משרת היא גני אביב, ואני גרה בליבה, אז אני יכולה לתאר אותה גם כמורה וגם כשכנה. היא גדולה, צפופה, ובעיקר מגוונת: רוב המשפחות דוברות רוסית, חלק מהן כבר דור שני ושלישי, משפחות יוצאות אתיופיה, משפחות צעירות שהגיעו מהמרכז, וקהילת הגרעין, שמונה היום כמה מאות משפחות. יש הרבה הורים שעובדים בנתב"ג ובמשמרות, ויש הרבה ילדים שחוזרים לבית ריק. מבחינת הילדים בכיתה שלי, אני רואה שלושה סוגים של בתים: בתים שבהם הלימודים הם הכול, בתים שבהם ההורים לא מצליחים לעקוב, ובתים שבהם יש הרבה ילדים ומעט זמן, כמו אצלי. השכונה השתנתה בשנים שאני כאן: יותר ילדים ברחוב, יותר גנים, יותר בתי כנסת, ובאותו זמן גם יותר תחושה אצל חלק מהוותיקים שהשכונה "נלקחת" מהם. אני מרגישה את זה בערבי הורים, ואני משתדלת לא להתעלם מזה.</w:t>
+        <w:t xml:space="preserve">השכונה שבית הספר משרת היא גני אביב, ואני גרה בליבה, אז אני יכולה לתאר אותה גם כמורה וגם כשכנה. היא גדולה, צפופה, ובעיקר מגוונת: רוב המשפחות דוברות רוסית, חלק מהן כבר דור שני ושלישי, משפחות יוצאות אתיופיה, משפחות צעירות שהגיעו מהמרכז, קהילת הגרעין, שמונה היום כמה מאות משפחות, ומשפחות ערביות, שבעשור האחרון הפכו לחלק קבוע מהשכונה. אלה בדרך כלל זוגות צעירים ומשכילים מהשכונות הערביות של לוד, שעברו לגני אביב בשביל דירה נורמלית ובית ספר עם משאבים, ובבניין שלי גרות שלוש משפחות כאלה. יש הרבה הורים שעובדים בנתב"ג ובמשמרות, ויש הרבה ילדים שחוזרים לבית ריק, ולכן המתנ"ס, עם הצהרון והחוגים, הוא מקום מרכזי: שם הילדים של כל הקבוצות נמצאים יחד עד חמש, ושם, בחוג הכדורגל, נוצרות החברויות שאני רואה אחר כך בכיתה. מבחינת הילדים בכיתה שלי, אני רואה שלושה סוגים של בתים: בתים שבהם הלימודים הם הכול, ושם יש גם משפחות רוסיות וגם משפחות ערביות, בתים שבהם ההורים לא מצליחים לעקוב, ובתים שבהם יש הרבה ילדים ומעט זמן, כמו אצלי. השכונה השתנתה בשנים שאני כאן: יותר ילדים ברחוב, יותר גנים, יותר בתי כנסת, ובאותו זמן גם יותר תחושה אצל חלק מהוותיקים שהשכונה "נלקחת" מהם, פעם על ידינו ופעם על ידי הערבים. אני מרגישה את זה בערבי הורים, ואני משתדלת לא להתעלם מזה.</w:t>
       </w:r>
     </w:p>
     <w:p>
@@ -1599,7 +1599,7 @@
           <w:szCs w:val="24"/>
           <w:rtl/>
         </w:rPr>
-        <w:t xml:space="preserve">הקשר עם ההורים הוא בשבילי החלק שאני הכי טובה בו והכי מתקשה בו, בו זמנית. אני טובה בו כי אני גרה פה, מכירה את המשפחות, פוגשת אותן בגינה ובמכולת, ויודעת מתי אבא חזר ממילואים ומתי סבתא חולה. ההורים יודעים שאני לא "מורה מבחוץ", וזה פותח דלתות. ואני מתקשה בו כי אני דתייה ומזוהה עם הגרעין, ויש הורים שבאים לשיחה הראשונה עם חשד: האם היא תנסה להדתות את הילד שלי. אני מתמודדת עם זה בשקיפות: אני אומרת בערב ההורים הראשון מי אני, מה אני מלמדת ומה לא, ושהבית הוא של ההורים והכיתה היא של כולם. הקשר מתהדק דרך הילדים: כשילד מצליח, ההורה סולח לי על הכיפה של הבעל שלי. והוא מתרופף כשמשהו בעיר מתלקח, סביב הגרעין או סביב פוליטיקה, ואז פתאום אני לא המחנכת אלא "אחת מהם". למדתי שבימים כאלה הכי טוב לדבר פחות ולהיות יותר.</w:t>
+        <w:t xml:space="preserve">הקשר עם ההורים הוא בשבילי החלק שאני הכי טובה בו והכי מתקשה בו, בו זמנית. אני טובה בו כי אני גרה פה, מכירה את המשפחות, פוגשת אותן בגינה ובמכולת, ויודעת מתי אבא חזר ממילואים ומתי סבתא חולה. ואני מתקשה בו כי אני דתייה ומזוהה עם הגרעין, ויש הורים שבאים לשיחה הראשונה עם חשד: האם היא תנסה להדתות את הילד שלי. עם ההורים הערבים החשד היה כפול, ואני מבינה למה: אישה דתייה מהגרעין, בעיניהם, היא מישהי שבאה לעיר עם מטרה. בשנה הראשונה שלי אמא של ג'וד, הילדה הערבייה בכיתה, לא הגיעה לאף אסיפה. בסוף השנה הזמנתי אותה לשיחה, ואמרתי לה את מה שאני אומרת לכולם: אני לא באתי לשנות את הילדים שלכם, באתי לגור לידכם. היא אמרה שהיא חיכתה שנה לשמוע את זה. היום היא בוועד הכיתה, והיא זו שהביאה לכיתה את הרמדאן, בשיעור שהיא העבירה בעצמה, ושאני ישבתי בו כתלמידה. הקשר מתהדק דרך הילדים: כשילד מצליח, ההורה סולח לי על הכיפה של הבעל שלי. והוא מתרופף כשמשהו בעיר מתלקח, סביב הגרעין או סביב יהודים וערבים, ואז פתאום אני לא המחנכת אלא "אחת מהם". למדתי שבימים כאלה הכי טוב לדבר פחות ולהיות יותר, ולהיות גם בשער של בית הספר וגם בחניה של הבניין, כדי שיראו שלא נעלמתי.</w:t>
       </w:r>
     </w:p>
     <w:p>
@@ -1635,7 +1635,7 @@
           <w:szCs w:val="24"/>
           <w:rtl/>
         </w:rPr>
-        <w:t xml:space="preserve">בשנה שעברה, בתקופת המלחמה, כשהיו הרבה אבות במילואים וכמה משפחות בכיתה עם אבא שלא בבית חודשים, ארגנו בכיתה שלי "מעגל משפחות": כל שבוע משפחה אחת אירחה שלוש משפחות אחרות לארוחת ערב, ובית הספר רק חיבר. ההורים בחרו בעצמם את מי לארח. אמא דוברת רוסית, שהבעל שלה במילואים, אירחה משפחה מהגרעין ומשפחה יוצאת אתיופיה, וסיפרה לי אחר כך שהיא לא זכרה מתי בפעם האחרונה מישהו ישב אצלה בבית. הילדים התחילו ללכת אחד לשני אחרי הלימודים. בטקס סוף השנה, המשפחות ישבו יחד ולא לפי קבוצות. אני חושבת שמה שעבד שם הוא שבית הספר לא ארגן אירוע אלא נתן תירוץ: המלחמה, המילואים, הצורך לעזור. האנשים עשו את השאר. מה שנשאר מזה הוא קבוצת הורים שממשיכה לדאוג למשפחות בכיתה כשמשהו קורה. היום, כשילד חולה, לא אני מתקשרת, אלא ההורים ביניהם.</w:t>
+        <w:t xml:space="preserve">בשנה שעברה, בתקופת המלחמה, כשהיו הרבה אבות במילואים וכמה משפחות בכיתה עם אבא שלא בבית חודשים, ארגנו בכיתה שלי "מעגל משפחות": כל שבוע משפחה אחת אירחה שלוש משפחות אחרות לארוחת ערב, ובית הספר רק חיבר. ההורים בחרו בעצמם את מי לארח. אמא דוברת רוסית, שהבעל שלה במילואים, אירחה משפחה מהגרעין ומשפחה יוצאת אתיופיה, וסיפרה לי אחר כך שהיא לא זכרה מתי בפעם האחרונה מישהו ישב אצלה בבית. ובשבוע הרביעי קרה הדבר שהכי זכור לי: המשפחה של ג'וד אירחה, בזמן המלחמה, משפחה שהאבא שלה במילואים. אני לא תכננתי את זה, ההורים בחרו. האבא חזר לשבת מהצפון, והלך לארוחת ערב אצל משפחה ערבית בבניין ממול, ואמר לי אחר כך "לא ידעתי מה אני עושה שם, ואז הילדים התחילו לשחק ושכחנו". הילדים התחילו ללכת אחד לשני אחרי הלימודים. בטקס סוף השנה, המשפחות ישבו יחד ולא לפי קבוצות. אני חושבת שמה שעבד שם הוא שבית הספר לא ארגן אירוע אלא נתן תירוץ: המלחמה, המילואים, הצורך לעזור. האנשים עשו את השאר. מה שנשאר מזה הוא קבוצת הורים שממשיכה לדאוג למשפחות בכיתה כשמשהו קורה, בלי קשר לשפה. היום, כשילד חולה, לא אני מתקשרת, אלא ההורים ביניהם.</w:t>
       </w:r>
     </w:p>
     <w:p>
@@ -1671,7 +1671,7 @@
           <w:szCs w:val="24"/>
           <w:rtl/>
         </w:rPr>
-        <w:t xml:space="preserve">היה מתח קשה סביב הגרעין, ואני הייתי במרכזו. לפני שלוש שנים הייתה הצעה, לא שלי, שבית הספר יפתח מסלול תורני בתוך הממלכתי. חלק מההורים, במיוחד הוותיקים דוברי הרוסית, ראו בזה השתלטות, ובקבוצות הוואטסאפ של השכונה כתבו דברים קשים, גם עליי בשם. היו הורים בכיתה שלי שביקשו להעביר את הילד לכיתה אחרת, רק בגלל מי אני. זה היה כואב, ובמשך חודש הייתי הולכת לבית הספר עם תחושה של בטן מכווצת. מה שעשיתי הוא שלא התגוננתי. ביקשתי מהמנהלת לקיים ערב פתוח, בלי במה, שבו ההורים יכולים להגיד מה הם מפחדים ממנו. הקשבתי שעתיים. ובסוף אמרתי משפט אחד: שאני לא באתי לשנות את הילדים שלהם, באתי לגור לידם. ההצעה על המסלול התורני ירדה, וטוב שכך, בעיניי, כי היא הייתה מפצלת את בית הספר. מה שנשאר ממני אחרי זה הוא הבנה שבשכונה כזאת כל דבר שאני עושה נקרא גם כפוליטיקה, גם אם אני רק מחנכת.</w:t>
+        <w:t xml:space="preserve">היה מתח קשה סביב הגרעין, ואני הייתי במרכזו: לפני שלוש שנים הייתה הצעה, לא שלי, שבית הספר יפתח מסלול תורני, וחלק מההורים הוותיקים ראו בזה השתלטות וכתבו עליי דברים קשים בשם. ביקשתי ערב פתוח, הקשבתי שעתיים, ואמרתי משפט אחד: שאני לא באתי לשנות את הילדים שלהם, באתי לגור לידם. ההצעה ירדה, וטוב שכך. אבל המתח שהכי שינה אותי היה במאי 2021. בלילות ההם, בשכונה שלנו, היו גברים שהתארגנו לשמירה, ובקבוצות דיברו על "מי גר בבניין". ובכיתה שלי היו שישה ילדים ערבים שלא הגיעו שבוע, ושלושה ילדים מהגרעין שהאבות שלהם היו בשמירה. ביום שהילדים הערבים חזרו, ילד מהגרעין אמר משהו, וג'וד בכתה, ואני עצרתי את השיעור. עשינו מעגל, ושאלתי כל ילד מה הוא פחד ממנו באותו שבוע. התברר שכולם פחדו, מאותם רעשים, באותם לילות, בבניינים סמוכים. קיבלתי אחר כך תלונה מהורה שאני "עושה דו קיום" וטלפון מהורה ערבי שאני "לא עשיתי מספיק". שניהם צדקו מהמקום שלהם. מה שנשאר ממני אחרי זה הוא הבנה שבשכונה כזאת כל דבר שאני עושה נקרא גם כפוליטיקה, גם אם אני רק מחנכת, ושבתור אישה מהגרעין, המעגל ההוא בכיתה היה אולי הדבר החשוב ביותר שעשיתי בלוד, בדיוק בגלל מי שאני.</w:t>
       </w:r>
     </w:p>
     <w:p>
@@ -1707,7 +1707,7 @@
           <w:szCs w:val="24"/>
           <w:rtl/>
         </w:rPr>
-        <w:t xml:space="preserve">בגני אביב, העירוב של לוד נוכח בעיקר כפחד. אין לנו תלמידים ערבים, והילדים מכירים את השכונות הערביות ממה ששומעים. במאי 2021, כשהיו המהומות, השכונה שלנו הייתה במתח גדול, חלק מהגברים התארגנו לשמירה, והילדים הגיעו לכיתה עם משפטים שלא רוצים לשמוע. בתור מחנכת, החלטתי שלא נתעלם: עשינו שיעור על "מה זה בית ומה זה שכן", והבאתי סיפור על שתי משפחות בעיר אחת. קיבלתי תלונה מהורה שאני "מחנכת לדו קיום" וטלפון מהורה אחר שאני לא מספיק מדברת על זה. בתור אישה מהגרעין, אני יודעת שיש שמייחסים לנו עמדה מסוימת, ואני לא רוצה לדבר בשם אחרים. מה שאני יכולה להגיד הוא שבשש שנים בלוד פגשתי מורות ערביות פעמיים, בהשתלמות עירונית, ושתי הפעמים האלה היו חשובות לי יותר מכל מה שקראתי. הקהילה של בית הספר שלנו היא יהודית לגמרי, בעיר שחצייה לא. אני לא יודעת אם זה צריך להשתנות ואיך, אבל אני יודעת שזה צריך להיאמר.</w:t>
+        <w:t xml:space="preserve">בגני אביב, העירוב של לוד הוא לא עניין של אירועים, הוא עניין של מי יושב בשורה השנייה. שישה ילדים ערבים בכיתה שלי, שישה או שבעה בכל כיתה בבית הספר, שגרים בבניינים שלנו, הולכים לאותו מתנ"ס, משחקים באותה קבוצת כדורגל ועומדים באותו תור לגלידה. בכיתה ו' זה בא לידי ביטוי בכל דבר: בשפה, כי הילדים הערבים מדברים עברית מושלמת שלמדו בחצר ובצהרון, ובכיתה ו' הם כבר מתקנים לילדים הרוסים דקדוק; בחברויות, שרובן נוצרו במתנ"ס ולא אצלי; בחגים, שאנחנו מציינים את כולם; ובשאלות הגדולות של כיתה ו', כי בגיל הזה הם מתחילים לשאול על העיר, על מה קרה במאי 2021, על המלחמה, על למה בשכונה של סבתא של ג'וד אין פארק כמו אצלנו. אני מלמדת לימודי ארץ ישראל, ובשנתיים האחרונות שיניתי את איך שאני מלמדת את לוד: לא רק "לוד של התנ"ך", אלא לוד של כולם, עם הסבא של ג'וד שנולד בעיר העתיקה, ועם הסבתא של ילד אחר שהגיעה מבוכרה. ומה שאני רואה גם הוא שהילדים הערבים בכיתה שלי הם גשר שהעיר לא משתמשת בו: הם יוצאים כל שבוע לשכונות הערביות לבקר משפחה, הם יודעים את שני הצדדים של לוד, ואף ילד יהודי בכיתה לא היה שם אף פעם. בשנה שעברה ג'וד הציעה שהכיתה תבקר בבית הספר של בת הדודה שלה. ביקשתי אישור, ולא קיבלתי, בגלל המצב. אני עדיין מבקשת.</w:t>
       </w:r>
     </w:p>
     <w:p>
@@ -1743,7 +1743,7 @@
           <w:szCs w:val="24"/>
           <w:rtl/>
         </w:rPr>
-        <w:t xml:space="preserve">בשבילי התפקיד ממשיך מחוץ לשער באופן הכי פשוט: אני גרה פה. הילדים שלי לומדים בבית הספר, הכיתה שלי גרה סביבי, ההורים הם השכנים. אני הולכת לשבעה ולברית ולבר מצווה, ואני לא רואה בזה "קשר עם הקהילה", אני רואה בזה חיים. מה שכן שונה ממורות אחרות הוא שאני שייכת גם לקהילה אחרת, הגרעין, שיש לה מטרות משלה בשכונה, ואני צריכה להיזהר שהתפקיד שלי כמחנכת לא ישמש אותה. למשל, אני לא מזמינה הורים מהכיתה לאירועים של הגרעין, גם כשהם היו רוצים לבוא. הקהילה מצפה ממני לדברים שלא כתובים, כמו לתווך כשיש סכסוך בבניין בין משפחה ותיקה למשפחה חדשה, או לדבר עם הורים כשמישהו רואה ילד מסתובב מאוחר. הגבול שלי הוא שאני לא עושה דבר בשכונה שלא הייתי עושה אם הייתי מחנכת בעיר אחרת. זה הכלל שעוזר לי להישאר מורה ולא נציגה.</w:t>
+        <w:t xml:space="preserve">בשבילי התפקיד ממשיך מחוץ לשער באופן הכי פשוט: אני גרה פה. הילדים שלי לומדים בבית הספר, הכיתה שלי גרה סביבי, ההורים הם השכנים, ובכלל זה ההורים הערבים מהבניין ממול, שהבן שלהם ובני באותה קבוצת כדורגל במתנ"ס. אני הולכת לשבעה ולברית ולבר מצווה, ובשנה שעברה גם לחגיגת עיד, בפעם הראשונה, ולמדתי שם שאפשר לשבת בבית של משפחה ערבית בלוד עם כיסוי ראש ולהרגיש בבית. אני לא רואה בזה "קשר עם הקהילה", אני רואה בזה חיים. מה שכן שונה ממורות אחרות הוא שאני שייכת גם לקהילה אחרת, הגרעין, שיש לה מטרות משלה בשכונה, ואני צריכה להיזהר שהתפקיד שלי כמחנכת לא ישמש אותה. למשל, אני לא מזמינה הורים מהכיתה לאירועים של הגרעין, גם כשהם היו רוצים לבוא. הקהילה מצפה ממני לדברים שלא כתובים, כמו לתווך כשיש סכסוך בבניין בין משפחה ותיקה למשפחה חדשה, או לדבר עם הורים כשמישהו רואה ילד מסתובב מאוחר. ובשנה האחרונה גם לתווך, פעמיים, בין משפחה יהודית למשפחה ערבית באותו בניין, על רעש ועל חניה, כי "את המחנכת של שניהם". הגבול שלי הוא שאני לא עושה דבר בשכונה שלא הייתי עושה אם הייתי מחנכת בעיר אחרת. זה הכלל שעוזר לי להישאר מורה ולא נציגה.</w:t>
       </w:r>
     </w:p>
     <w:p>
@@ -1779,7 +1779,7 @@
           <w:szCs w:val="24"/>
           <w:rtl/>
         </w:rPr>
-        <w:t xml:space="preserve">השייכות שלי לבית הספר היא קודם כול דרך הילדים, שאני פוגשת ברחוב ושקוראים לי "רחל" ולא "המורה", כי הם מכירים אותי מהגינה. ודרך הצוות: בחדר המורים אני היחידה מהגרעין, ובהתחלה הרגשתי שבודקים אותי, והיום אני מרגישה שאני חלק. מה שגורם לי להרגיש לא שייכת הוא דווקא רגעים של שיח פוליטי בחדר המורים או בקבוצות ההורים, שבהם אני מבינה שבעיני חלק מהאנשים אני לפני הכול "הגרעין", ורק אחר כך המחנכת של הילד שלהם. ואני מודה שגם בתוך הגרעין יש מי שתוהה למה אני מלמדת בממלכתי ולא בבית ספר "שלנו", ואז אני לא שייכת לגמרי גם שם. אולי זה המקום שלי: באמצע. בשש שנים למדתי שהאמצע הוא לא מקום נוח, אבל הוא המקום שבו בית ספר בשכונה כזאת צריך מישהו שיעמוד.</w:t>
+        <w:t xml:space="preserve">השייכות שלי לבית הספר היא קודם כול דרך הילדים, שאני פוגשת ברחוב ושקוראים לי "רחל" ולא "המורה", כי הם מכירים אותי מהגינה. ודרך הצוות: בחדר המורים אני היחידה מהגרעין, ובהתחלה הרגשתי שבודקים אותי, והיום אני מרגישה שאני חלק. ודרך דבר שהפתיע אותי: ההורים הערבים בכיתה. אחרי השנה הראשונה הקשה, הם הפכו להורים שהכי מגבים אותי, אולי כי שנינו יודעים מה זה להיות מי שחושדים בו בשכונה. מה שגורם לי להרגיש לא שייכת הוא רגעים של שיח פוליטי בחדר המורים או בקבוצות ההורים, שבהם אני מבינה שבעיני חלק מהאנשים אני לפני הכול "הגרעין", ורק אחר כך המחנכת של הילד שלהם. ואני מודה שגם בתוך הגרעין יש מי שתוהה למה אני מלמדת בממלכתי, ולמה הילדים שלי הם החברים של ילדים ערבים, ואז אני לא שייכת לגמרי גם שם. אולי זה המקום שלי: באמצע. בשש שנים למדתי שהאמצע הוא לא מקום נוח, אבל הוא המקום שבו בית ספר בשכונה כזאת צריך מישהו שיעמוד.</w:t>
       </w:r>
     </w:p>
     <w:p>
@@ -1815,7 +1815,7 @@
           <w:szCs w:val="24"/>
           <w:rtl/>
         </w:rPr>
-        <w:t xml:space="preserve">הייתי משנה את הדרך שבה ההורים נכנסים לבית הספר: היום הם נכנסים רק כאורחים, לטקס, לשיחה, לאסיפה. הייתי רוצה שיהיה להם תפקיד קבוע בתוכו, למשל שבכל כיתה יהיה "הורה מלווה" שמגיע פעם בשבוע לשעה, לא כדי לפקח, אלא כדי לקרוא עם ילדים, לעזור בחצר, להיות. בשכונה שבה הרבה ילדים חוזרים לבית ריק, הורה אחד שנמצא הוא משהו. ולמה דווקא זה? כי כל מה שסיפרתי על המעגל של המשפחות התחיל מזה שהורה אחד עשה דבר אחד בשביל ילד של מישהו אחר, ומזה באה האמון. אירועים גדולים לא עושים את זה, הם עושים תמונה. הורה שנמצא בכיתה פעם בשבוע רואה את הילדים של השכנים בעיניים אחרות, ובסופו של דבר זה מה שקהילה היא: לראות את הילד של השכן כמו את שלך. אני יודעת שזה דורש אמון מהצוות, ושיש מורות שלא ירצו הורה בכיתה. הייתי מתחילה עם מי שרוצה.</w:t>
+        <w:t xml:space="preserve">הייתי משנה את הדרך שבה ההורים נכנסים לבית הספר: היום הם נכנסים רק כאורחים, לטקס, לשיחה, לאסיפה. הייתי רוצה שיהיה להם תפקיד קבוע בתוכו, למשל שבכל כיתה יהיה "הורה מלווה" שמגיע פעם בשבוע לשעה, לא כדי לפקח, אלא כדי לקרוא עם ילדים, לעזור בחצר, להיות. ובכיתה כמו שלי הייתי רוצה שזה יהיה זוג הורים, אחד יהודי ואחד ערבי, שמגיעים יחד, כי בשכונה שבה הרבה ילדים חוזרים לבית ריק, הורה אחד שנמצא הוא משהו, ושני הורים משתי הקבוצות שנמצאים יחד הם משהו שהילדים לא רואים בשום מקום אחר. ולמה דווקא זה? כי כל מה שסיפרתי על המעגל של המשפחות התחיל מזה שהורה אחד עשה דבר אחד בשביל ילד של מישהו אחר, ומזה באה האמון. אירועים גדולים לא עושים את זה, הם עושים תמונה. הורה שנמצא בכיתה פעם בשבוע רואה את הילדים של השכנים בעיניים אחרות, ובסופו של דבר זה מה שקהילה היא: לראות את הילד של השכן כמו את שלך, גם כשהשכן מתפלל במקום אחר. אני יודעת שזה דורש אמון מהצוות. הייתי מתחילה עם מי שרוצה, ואני יודעת מי ירצו ראשונים: אמא של ג'וד ואמא מהגרעין מהכיתה שלי. הן כבר שאלו.</w:t>
       </w:r>
     </w:p>
     <w:p>
@@ -1851,7 +1851,7 @@
           <w:szCs w:val="24"/>
           <w:rtl/>
         </w:rPr>
-        <w:t xml:space="preserve">כן, הייתי רוצה שהמחקר ישאל גם על הדת, בלי לפחד מזה. בשכונה שלנו הדתיות היא אחד הקווים שמפרידים, ובית הספר, שהוא ממלכתי, לא יודע איך לדבר על זה. יש ילדים שמגיעים מבית חילוני, מבית מסורתי, מבית דתי, ובחגים ובטקסים זה עולה כל פעם מחדש: מה שרים, מה מברכים, מי מגיע בשבת ומי לא. אם המחקר על קהילה יתעלם מזה, הוא יראה קהילה שאין. ועוד דבר, קטן: תשאלי את המורות מה הן עושות בערב. כי המורה שגרה בשכונה, שהולכת בערב לבית הכנסת או לגינה או לקבוצת הרוסים, היא מורה אחרת בבוקר, ואני חושבת שזה חלק מהתשובה על מה זה קהילה ובית ספר. ואם מותר לי עוד משפט: אל תפחדי לכתוב על המתח. כל מי שתראייני בגני אביב תספר לך על ימים יפים, ויש כאלה, אבל הקהילה הזאת היא גם ויכוח מתמיד על מי היא, ובית הספר הוא המקום שבו הוויכוח הזה מתנהל בעדינות, דרך הילדים, במקום ברחוב. זה לא כישלון של הקהילה, זה אולי התפקיד הכי חשוב שבית ספר יכול למלא בשכונה כזאת.</w:t>
+        <w:t xml:space="preserve">כן, הייתי רוצה שהמחקר ישאל גם על הדת, בלי לפחד מזה, ובשכונה שלנו זה אומר על שלוש דתות ושלוש דרגות של דתיות: הילד מהגרעין, הילד המסורתי מאתיופיה, הילד החילוני מאוקראינה, הילד המוסלמי שצם ברמדאן והילד הערבי שלא. בית הספר, שהוא ממלכתי, לא יודע איך לדבר על זה, ובחגים ובטקסים זה עולה כל פעם מחדש: מה שרים, מה מברכים, מי מגיע בשבת ומי לא, ומה עושים ביום הזיכרון עם ילד שהמשפחה שלו זוכרת דברים אחרים. אם המחקר על קהילה יתעלם מזה, הוא יראה קהילה שאין. ועוד דבר, קטן: תשאלי את המורות מה הן עושות בערב. כי המורה שגרה בשכונה, שהולכת בערב לבית הכנסת או לגינה או לקבוצת הרוסים, או שיושבת אצל השכנה הערבייה לקפה, היא מורה אחרת בבוקר. ואם מותר לי עוד משפט: אל תפחדי לכתוב על המתח. כל מי שתראייני בגני אביב תספר לך על ימים יפים, ויש כאלה, אבל הקהילה הזאת היא גם ויכוח מתמיד על מי היא, ובית הספר הוא המקום שבו הוויכוח הזה מתנהל בעדינות, דרך הילדים, במקום ברחוב. זה לא כישלון של הקהילה, זה אולי התפקיד הכי חשוב שבית ספר יכול למלא בעיר כזאת.</w:t>
       </w:r>
     </w:p>
     <w:p>
@@ -2161,7 +2161,7 @@
           <w:szCs w:val="24"/>
           <w:rtl/>
         </w:rPr>
-        <w:t xml:space="preserve">בלוד העיר המעורבת נוכחת אצלנו בכל יום, אבל לא בצורה שחושבים. התלמידים שלי יודעים עברית מהטלוויזיה ומהרחוב, הם רואים יהודים בקניון ובקופת חולים, חלק מההורים עובדים אצל יהודים. אבל בבית הספר אין יהודים, ובשכונה כמעט אין, ובתי הספר היהודיים הם עולם אחר, עם תקציבים ובניינים שאנחנו רואים ולא מקבלים. אז העירוב בא לידי ביטוי קודם כול כהשוואה: ההורים שלי יודעים בדיוק מה יש בגני אביב ומה אין אצלנו. ובמאי 2021 זה בא לידי ביטוי כפחד: השכונה הייתה סגורה, ילדים ראו דברים, ואני הייתי צריכה ללמד למחרת. עשינו שבועיים של שיעורים בלי ספרים, רק דיבור וציור. ויש גם צד אחר: יש קשר בין המנהלת שלנו למנהלת של בית ספר יהודי בעיר, ופעמיים נפגשו כיתות ו'. הילדים חזרו ואמרו "הם כמונו". זה נמשך שבוע. המלחמה עצרה את זה. אם לשאול אם העירוב הוא חלק מהקהילה של בית הספר, אני אומרת שהוא חלק מהחיים של הקהילה, והוא בעיקר חלק ממה שהיא לא מקבלת.</w:t>
+        <w:t xml:space="preserve">בלוד העיר המעורבת נוכחת אצלנו בכל יום, אבל לא בצורה שחושבים. התלמידים שלי יודעים עברית מהטלוויזיה ומהרחוב, הם רואים יהודים בקניון ובקופת חולים, חלק מההורים עובדים אצל יהודים. אבל בבית הספר אין יהודים, ובשכונה כמעט אין, ובתי הספר היהודיים הם עולם אחר, עם תקציבים ובניינים שאנחנו רואים ולא מקבלים. אז העירוב בא לידי ביטוי קודם כול כהשוואה: ההורים שלי יודעים בדיוק מה יש בגני אביב ומה אין אצלנו. וחלק מהם לא רק יודעים, הם עוברים: בכל שנה כמה משפחות מהשכונה, בדרך כלל הצעירות והמשכילות, קונות דירה בגני אביב ורושמות את הילדים לבית ספר יהודי שם. אני רואה את זה בכיתה שלי: בכיתה א' היו שלושים ושלושה ילדים, ובכיתה ד' נשארו שלושים ואחד, והשניים שעזבו הם הילדים שההורים שלהם יכלו. אז העיר המעורבת בשבילנו היא גם הדלת שדרכה יוצאים מי שיכולים, ומי שנשאר הם מי שלא. ובחגים, כשבני הדודים מגני אביב באים לבקר, הילדים שלי שומעים על חדר מחשבים ועל חוג כדורגל עם ילדים יהודים, וחוזרים אליי עם שאלות שאין לי תשובה עליהן. ובמאי 2021 זה בא לידי ביטוי כפחד: השכונה הייתה סגורה, ילדים ראו דברים, ואני הייתי צריכה ללמד למחרת. עשינו שבועיים של שיעורים בלי ספרים, רק דיבור וציור. ויש גם צד אחר: יש קשר בין המנהלת שלנו למנהלת של בית ספר יהודי בעיר, ופעמיים נפגשו כיתות ו'. הילדים חזרו ואמרו "הם כמונו". זה נמשך שבוע. המלחמה עצרה את זה. אם לשאול אם העירוב הוא חלק מהקהילה של בית הספר, אני אומרת שהוא חלק מהחיים של הקהילה, והוא בעיקר חלק ממה שהיא לא מקבלת.</w:t>
       </w:r>
     </w:p>
     <w:p>
@@ -3069,7 +3069,7 @@
           <w:szCs w:val="24"/>
           <w:rtl/>
         </w:rPr>
-        <w:t xml:space="preserve">העירוב של לוד נוכח אצלנו בעיקר כהיעדר. בשכונה אין יהודים, בבית הספר אין יהודים, הילדים רואים אותם בקניון, במרפאה, בעירייה, ובחדשות. הם יודעים עברית מהטלוויזיה ומהעבודה של האבא. ובאותו זמן, לוד נוכחת בכל השוואה: ההורים יודעים כמה כיתות יש בבית ספר יהודי בעיר וכמה אצלנו, ואומרים את זה. אחרי מאי 2021 העירוב הפך לפחד ולכעס, אצל הילדים ואצל ההורים, ואצלנו כצוות היה ויכוח אם לדבר על זה בכיתה או לא. דיברנו, בזהירות, ולא כולם הסכימו. בשנים האחרונות העירייה ניסתה לקיים מפגשים בין בתי ספר, ואנחנו השתתפנו בשניים. הילדים חזרו שמחים, ההורים חלקם כעסו, והמלחמה עצרה את זה בכל מקרה. אני מאמינה שזה צריך להימשך, אבל אני גם יודעת שהקהילה שלי לא בשלה לזה עכשיו, ושאני, כמי שגרה בה, לא יכולה להוביל את זה בלי שהיא תבוא איתי. זה אולי ההבדל ביני לבין מורה מבחוץ: אני לא יכולה לעשות דברים נגד השכונה ולנסוע הביתה.</w:t>
+        <w:t xml:space="preserve">העירוב של לוד נוכח אצלנו בעיקר כהיעדר. בשכונה אין יהודים, בבית הספר אין יהודים, הילדים רואים אותם בקניון, במרפאה, בעירייה, ובחדשות. הם יודעים עברית מהטלוויזיה ומהעבודה של האבא. ובאותו זמן, לוד נוכחת בכל השוואה: ההורים יודעים כמה כיתות יש בבית ספר יהודי בעיר וכמה אצלנו, ואומרים את זה. ויש תופעה שבעשר השנים האחרונות אני רואה מקרוב: משפחות מהשכונה שעוברות לגני אביב, ושולחות את הילדים לבתי הספר היהודיים שם. שתי אחייניות שלי לומדות ככה, בכיתות עם ילדים יהודים, ומדברות עברית כמוהם. אני לא יודעת מה להרגיש לגבי זה. מצד אחד, אלה ילדים שמקבלים מה שאנחנו לא יכולים לתת. מצד שני, כל משפחה כזאת שיוצאת היא משפחה חזקה פחות בשכונה שלנו, ובית הספר שלנו נשאר עם מי שאין לו לאן ללכת. העיר המעורבת מתקיימת, אם כך, בגני אביב, ולא כאן, ואנחנו משלמים על זה. אחרי מאי 2021 העירוב הפך לפחד ולכעס, אצל הילדים ואצל ההורים, ואצלנו כצוות היה ויכוח אם לדבר על זה בכיתה או לא. דיברנו, בזהירות, ולא כולם הסכימו. בשנים האחרונות העירייה ניסתה לקיים מפגשים בין בתי ספר, ואנחנו השתתפנו בשניים. הילדים חזרו שמחים, ההורים חלקם כעסו, והמלחמה עצרה את זה בכל מקרה. אני מאמינה שזה צריך להימשך, אבל אני גם יודעת שהקהילה שלי לא בשלה לזה עכשיו, ושאני, כמי שגרה בה, לא יכולה להוביל את זה בלי שהיא תבוא איתי. זה אולי ההבדל ביני לבין מורה מבחוץ: אני לא יכולה לעשות דברים נגד השכונה ולנסוע הביתה.</w:t>
       </w:r>
     </w:p>
     <w:p>

</xml_diff>